<commit_message>
To Implement role-based trouble ticket permissions
</commit_message>
<xml_diff>
--- a/document/assigned_tt.docx
+++ b/document/assigned_tt.docx
@@ -4,7 +4,36 @@
   <w:body>
     <w:p/>
     <w:p>
-      <w:hyperlink r:id="rId4" w:history="1">
+      <w:hyperlink r:id="rId5" w:history="1">
+        <w:r>
+          <w:rPr>
+            <w:rStyle w:val="Hyperlink"/>
+          </w:rPr>
+          <w:t>https://chatgpt.com/g/g-p-6a5378cdfc588191b929a3b5ca9c1c9a/c/6a8fdf9d-618c-83ee-b461-0d4b28f9b9f8</w:t>
+        </w:r>
+      </w:hyperlink>
+    </w:p>
+    <w:p/>
+    <w:p>
+      <w:r>
+        <w:t xml:space="preserve">Date : </w:t>
+      </w:r>
+      <w:r>
+        <w:t>7</w:t>
+      </w:r>
+      <w:r>
+        <w:rPr>
+          <w:vertAlign w:val="superscript"/>
+        </w:rPr>
+        <w:t>th</w:t>
+      </w:r>
+      <w:r>
+        <w:t xml:space="preserve"> September, 2026</w:t>
+      </w:r>
+    </w:p>
+    <w:p/>
+    <w:p>
+      <w:hyperlink r:id="rId6" w:history="1">
         <w:r>
           <w:rPr>
             <w:rStyle w:val="Hyperlink"/>
@@ -15,16 +44,8 @@
     </w:p>
     <w:p/>
     <w:p>
-      <w:proofErr w:type="gramStart"/>
-      <w:r>
-        <w:t>Date :</w:t>
-      </w:r>
-      <w:proofErr w:type="gramEnd"/>
-      <w:r>
-        <w:t xml:space="preserve"> </w:t>
-      </w:r>
-      <w:r>
-        <w:t>6</w:t>
+      <w:r>
+        <w:t>Date : 6</w:t>
       </w:r>
       <w:r>
         <w:rPr>
@@ -33,57 +54,33 @@
         <w:t>th</w:t>
       </w:r>
       <w:r>
-        <w:t xml:space="preserve"> </w:t>
-      </w:r>
-      <w:proofErr w:type="gramStart"/>
-      <w:r>
-        <w:t>September</w:t>
-      </w:r>
+        <w:t xml:space="preserve"> September, 2026</w:t>
+      </w:r>
+    </w:p>
+    <w:p/>
+    <w:p>
+      <w:r>
+        <w:t>SELECT</w:t>
+      </w:r>
+    </w:p>
+    <w:p>
+      <w:r>
+        <w:t xml:space="preserve">    MAX(id) AS </w:t>
+      </w:r>
+      <w:proofErr w:type="spellStart"/>
+      <w:r>
+        <w:t>last_id</w:t>
+      </w:r>
+      <w:proofErr w:type="spellEnd"/>
       <w:r>
         <w:t>,</w:t>
       </w:r>
-      <w:proofErr w:type="gramEnd"/>
-      <w:r>
-        <w:t xml:space="preserve"> 2026</w:t>
-      </w:r>
-    </w:p>
-    <w:p/>
-    <w:p>
-      <w:r>
-        <w:t>SELECT</w:t>
-      </w:r>
-    </w:p>
-    <w:p>
-      <w:r>
-        <w:t xml:space="preserve">    </w:t>
-      </w:r>
-      <w:proofErr w:type="gramStart"/>
-      <w:r>
-        <w:t>MAX(</w:t>
-      </w:r>
-      <w:proofErr w:type="gramEnd"/>
-      <w:r>
-        <w:t xml:space="preserve">id) AS </w:t>
-      </w:r>
-      <w:proofErr w:type="spellStart"/>
-      <w:r>
-        <w:t>last_id</w:t>
-      </w:r>
-      <w:proofErr w:type="spellEnd"/>
-      <w:r>
-        <w:t>,</w:t>
-      </w:r>
-    </w:p>
-    <w:p>
-      <w:r>
-        <w:t xml:space="preserve">    </w:t>
-      </w:r>
-      <w:proofErr w:type="gramStart"/>
-      <w:r>
-        <w:t>MAX(</w:t>
-      </w:r>
-      <w:proofErr w:type="spellStart"/>
-      <w:proofErr w:type="gramEnd"/>
+    </w:p>
+    <w:p>
+      <w:r>
+        <w:t xml:space="preserve">    MAX(</w:t>
+      </w:r>
+      <w:proofErr w:type="spellStart"/>
       <w:r>
         <w:t>tt_no</w:t>
       </w:r>
@@ -102,13 +99,8 @@
         <w:t xml:space="preserve">FROM </w:t>
       </w:r>
       <w:proofErr w:type="spellStart"/>
-      <w:proofErr w:type="gramStart"/>
-      <w:r>
-        <w:t>public.trouble</w:t>
-      </w:r>
-      <w:proofErr w:type="gramEnd"/>
-      <w:r>
-        <w:t>_tickets</w:t>
+      <w:r>
+        <w:t>public.trouble_tickets</w:t>
       </w:r>
       <w:proofErr w:type="spellEnd"/>
       <w:r>
@@ -118,6 +110,9 @@
     <w:p/>
     <w:p>
       <w:r>
+        <w:rPr>
+          <w:noProof/>
+        </w:rPr>
         <w:drawing>
           <wp:inline distT="0" distB="0" distL="0" distR="0" wp14:anchorId="2E4D8356" wp14:editId="44478FA1">
             <wp:extent cx="5943600" cy="3190875"/>
@@ -134,7 +129,7 @@
                     <pic:cNvPicPr/>
                   </pic:nvPicPr>
                   <pic:blipFill>
-                    <a:blip r:embed="rId5"/>
+                    <a:blip r:embed="rId7"/>
                     <a:stretch>
                       <a:fillRect/>
                     </a:stretch>
@@ -200,12 +195,10 @@
     <w:p/>
     <w:p>
       <w:proofErr w:type="spellStart"/>
-      <w:proofErr w:type="gramStart"/>
       <w:r>
         <w:t>shakil.khan</w:t>
       </w:r>
       <w:proofErr w:type="spellEnd"/>
-      <w:proofErr w:type="gramEnd"/>
     </w:p>
     <w:p>
       <w:r>
@@ -299,90 +292,3068 @@
     </w:p>
     <w:p>
       <w:r>
+        <w:t>User Role</w:t>
+      </w:r>
+    </w:p>
+    <w:p>
+      <w:r>
+        <w:t xml:space="preserve">       ↓</w:t>
+      </w:r>
+    </w:p>
+    <w:p>
+      <w:r>
+        <w:t>Role Permissions</w:t>
+      </w:r>
+    </w:p>
+    <w:p>
+      <w:r>
+        <w:t xml:space="preserve">       ↓</w:t>
+      </w:r>
+    </w:p>
+    <w:p>
+      <w:r>
+        <w:t>["TT_VIEW", "TT_ASSIGN", "TT_REQUISITION"]</w:t>
+      </w:r>
+    </w:p>
+    <w:p>
+      <w:r>
+        <w:t xml:space="preserve">       ↓</w:t>
+      </w:r>
+    </w:p>
+    <w:p>
+      <w:proofErr w:type="spellStart"/>
+      <w:r>
+        <w:t>mapTTPermissions</w:t>
+      </w:r>
+      <w:proofErr w:type="spellEnd"/>
+      <w:r>
+        <w:t>()</w:t>
+      </w:r>
+    </w:p>
+    <w:p>
+      <w:r>
+        <w:t xml:space="preserve">       ↓</w:t>
+      </w:r>
+    </w:p>
+    <w:p>
+      <w:proofErr w:type="spellStart"/>
+      <w:r>
+        <w:t>TTActionPermissions</w:t>
+      </w:r>
+      <w:proofErr w:type="spellEnd"/>
+    </w:p>
+    <w:p>
+      <w:r>
+        <w:t xml:space="preserve">       ↓</w:t>
+      </w:r>
+    </w:p>
+    <w:p>
+      <w:proofErr w:type="spellStart"/>
+      <w:r>
+        <w:t>createTTColumns</w:t>
+      </w:r>
+      <w:proofErr w:type="spellEnd"/>
+      <w:r>
+        <w:t>()</w:t>
+      </w:r>
+    </w:p>
+    <w:p>
+      <w:r>
+        <w:t xml:space="preserve">       ↓</w:t>
+      </w:r>
+    </w:p>
+    <w:p>
+      <w:r>
+        <w:t>Action Menu</w:t>
+      </w:r>
+    </w:p>
+    <w:p/>
+    <w:p/>
+    <w:p>
+      <w:r>
+        <w:t>Your policy should be enforced like this:</w:t>
+      </w:r>
+    </w:p>
+    <w:tbl>
+      <w:tblPr>
+        <w:tblW w:w="0" w:type="auto"/>
+        <w:tblCellSpacing w:w="15" w:type="dxa"/>
+        <w:tblCellMar>
+          <w:top w:w="15" w:type="dxa"/>
+          <w:left w:w="15" w:type="dxa"/>
+          <w:bottom w:w="15" w:type="dxa"/>
+          <w:right w:w="15" w:type="dxa"/>
+        </w:tblCellMar>
+        <w:tblLook w:val="04A0" w:firstRow="1" w:lastRow="0" w:firstColumn="1" w:lastColumn="0" w:noHBand="0" w:noVBand="1"/>
+      </w:tblPr>
+      <w:tblGrid>
+        <w:gridCol w:w="1106"/>
+        <w:gridCol w:w="560"/>
+        <w:gridCol w:w="699"/>
+        <w:gridCol w:w="1182"/>
+        <w:gridCol w:w="445"/>
+        <w:gridCol w:w="727"/>
+      </w:tblGrid>
+      <w:tr>
+        <w:trPr>
+          <w:tblHeader/>
+          <w:tblCellSpacing w:w="15" w:type="dxa"/>
+        </w:trPr>
+        <w:tc>
+          <w:tcPr>
+            <w:tcW w:w="0" w:type="auto"/>
+            <w:vAlign w:val="center"/>
+            <w:hideMark/>
+          </w:tcPr>
+          <w:p>
+            <w:pPr>
+              <w:rPr>
+                <w:b/>
+                <w:bCs/>
+              </w:rPr>
+            </w:pPr>
+            <w:r>
+              <w:rPr>
+                <w:b/>
+                <w:bCs/>
+              </w:rPr>
+              <w:t>Role</w:t>
+            </w:r>
+          </w:p>
+        </w:tc>
+        <w:tc>
+          <w:tcPr>
+            <w:tcW w:w="0" w:type="auto"/>
+            <w:vAlign w:val="center"/>
+            <w:hideMark/>
+          </w:tcPr>
+          <w:p>
+            <w:pPr>
+              <w:rPr>
+                <w:b/>
+                <w:bCs/>
+              </w:rPr>
+            </w:pPr>
+            <w:r>
+              <w:rPr>
+                <w:b/>
+                <w:bCs/>
+              </w:rPr>
+              <w:t>View</w:t>
+            </w:r>
+          </w:p>
+        </w:tc>
+        <w:tc>
+          <w:tcPr>
+            <w:tcW w:w="0" w:type="auto"/>
+            <w:vAlign w:val="center"/>
+            <w:hideMark/>
+          </w:tcPr>
+          <w:p>
+            <w:pPr>
+              <w:rPr>
+                <w:b/>
+                <w:bCs/>
+              </w:rPr>
+            </w:pPr>
+            <w:r>
+              <w:rPr>
+                <w:b/>
+                <w:bCs/>
+              </w:rPr>
+              <w:t>Assign</w:t>
+            </w:r>
+          </w:p>
+        </w:tc>
+        <w:tc>
+          <w:tcPr>
+            <w:tcW w:w="0" w:type="auto"/>
+            <w:vAlign w:val="center"/>
+            <w:hideMark/>
+          </w:tcPr>
+          <w:p>
+            <w:pPr>
+              <w:rPr>
+                <w:b/>
+                <w:bCs/>
+              </w:rPr>
+            </w:pPr>
+            <w:r>
+              <w:rPr>
+                <w:b/>
+                <w:bCs/>
+              </w:rPr>
+              <w:t>Requisition</w:t>
+            </w:r>
+          </w:p>
+        </w:tc>
+        <w:tc>
+          <w:tcPr>
+            <w:tcW w:w="0" w:type="auto"/>
+            <w:vAlign w:val="center"/>
+            <w:hideMark/>
+          </w:tcPr>
+          <w:p>
+            <w:pPr>
+              <w:rPr>
+                <w:b/>
+                <w:bCs/>
+              </w:rPr>
+            </w:pPr>
+            <w:r>
+              <w:rPr>
+                <w:b/>
+                <w:bCs/>
+              </w:rPr>
+              <w:t>Edit</w:t>
+            </w:r>
+          </w:p>
+        </w:tc>
+        <w:tc>
+          <w:tcPr>
+            <w:tcW w:w="0" w:type="auto"/>
+            <w:vAlign w:val="center"/>
+            <w:hideMark/>
+          </w:tcPr>
+          <w:p>
+            <w:pPr>
+              <w:rPr>
+                <w:b/>
+                <w:bCs/>
+              </w:rPr>
+            </w:pPr>
+            <w:r>
+              <w:rPr>
+                <w:b/>
+                <w:bCs/>
+              </w:rPr>
+              <w:t>Delete</w:t>
+            </w:r>
+          </w:p>
+        </w:tc>
+      </w:tr>
+      <w:tr>
+        <w:trPr>
+          <w:tblCellSpacing w:w="15" w:type="dxa"/>
+        </w:trPr>
+        <w:tc>
+          <w:tcPr>
+            <w:tcW w:w="0" w:type="auto"/>
+            <w:vAlign w:val="center"/>
+            <w:hideMark/>
+          </w:tcPr>
+          <w:p>
+            <w:r>
+              <w:rPr>
+                <w:b/>
+                <w:bCs/>
+              </w:rPr>
+              <w:t>ROOT</w:t>
+            </w:r>
+          </w:p>
+        </w:tc>
+        <w:tc>
+          <w:tcPr>
+            <w:tcW w:w="0" w:type="auto"/>
+            <w:vAlign w:val="center"/>
+            <w:hideMark/>
+          </w:tcPr>
+          <w:p>
+            <w:r>
+              <w:rPr>
+                <w:rFonts w:ascii="Segoe UI Emoji" w:hAnsi="Segoe UI Emoji" w:cs="Segoe UI Emoji"/>
+              </w:rPr>
+              <w:t>✅</w:t>
+            </w:r>
+          </w:p>
+        </w:tc>
+        <w:tc>
+          <w:tcPr>
+            <w:tcW w:w="0" w:type="auto"/>
+            <w:vAlign w:val="center"/>
+            <w:hideMark/>
+          </w:tcPr>
+          <w:p>
+            <w:r>
+              <w:rPr>
+                <w:rFonts w:ascii="Segoe UI Emoji" w:hAnsi="Segoe UI Emoji" w:cs="Segoe UI Emoji"/>
+              </w:rPr>
+              <w:t>✅</w:t>
+            </w:r>
+          </w:p>
+        </w:tc>
+        <w:tc>
+          <w:tcPr>
+            <w:tcW w:w="0" w:type="auto"/>
+            <w:vAlign w:val="center"/>
+            <w:hideMark/>
+          </w:tcPr>
+          <w:p>
+            <w:r>
+              <w:rPr>
+                <w:rFonts w:ascii="Segoe UI Emoji" w:hAnsi="Segoe UI Emoji" w:cs="Segoe UI Emoji"/>
+              </w:rPr>
+              <w:t>✅</w:t>
+            </w:r>
+          </w:p>
+        </w:tc>
+        <w:tc>
+          <w:tcPr>
+            <w:tcW w:w="0" w:type="auto"/>
+            <w:vAlign w:val="center"/>
+            <w:hideMark/>
+          </w:tcPr>
+          <w:p>
+            <w:r>
+              <w:rPr>
+                <w:rFonts w:ascii="Segoe UI Emoji" w:hAnsi="Segoe UI Emoji" w:cs="Segoe UI Emoji"/>
+              </w:rPr>
+              <w:t>✅</w:t>
+            </w:r>
+          </w:p>
+        </w:tc>
+        <w:tc>
+          <w:tcPr>
+            <w:tcW w:w="0" w:type="auto"/>
+            <w:vAlign w:val="center"/>
+            <w:hideMark/>
+          </w:tcPr>
+          <w:p>
+            <w:r>
+              <w:rPr>
+                <w:rFonts w:ascii="Segoe UI Emoji" w:hAnsi="Segoe UI Emoji" w:cs="Segoe UI Emoji"/>
+              </w:rPr>
+              <w:t>✅</w:t>
+            </w:r>
+          </w:p>
+        </w:tc>
+      </w:tr>
+      <w:tr>
+        <w:trPr>
+          <w:tblCellSpacing w:w="15" w:type="dxa"/>
+        </w:trPr>
+        <w:tc>
+          <w:tcPr>
+            <w:tcW w:w="0" w:type="auto"/>
+            <w:vAlign w:val="center"/>
+            <w:hideMark/>
+          </w:tcPr>
+          <w:p>
+            <w:r>
+              <w:rPr>
+                <w:b/>
+                <w:bCs/>
+              </w:rPr>
+              <w:t>IT_ADMIN</w:t>
+            </w:r>
+          </w:p>
+        </w:tc>
+        <w:tc>
+          <w:tcPr>
+            <w:tcW w:w="0" w:type="auto"/>
+            <w:vAlign w:val="center"/>
+            <w:hideMark/>
+          </w:tcPr>
+          <w:p>
+            <w:r>
+              <w:rPr>
+                <w:rFonts w:ascii="Segoe UI Emoji" w:hAnsi="Segoe UI Emoji" w:cs="Segoe UI Emoji"/>
+              </w:rPr>
+              <w:t>✅</w:t>
+            </w:r>
+          </w:p>
+        </w:tc>
+        <w:tc>
+          <w:tcPr>
+            <w:tcW w:w="0" w:type="auto"/>
+            <w:vAlign w:val="center"/>
+            <w:hideMark/>
+          </w:tcPr>
+          <w:p>
+            <w:r>
+              <w:rPr>
+                <w:rFonts w:ascii="Segoe UI Emoji" w:hAnsi="Segoe UI Emoji" w:cs="Segoe UI Emoji"/>
+              </w:rPr>
+              <w:t>✅</w:t>
+            </w:r>
+          </w:p>
+        </w:tc>
+        <w:tc>
+          <w:tcPr>
+            <w:tcW w:w="0" w:type="auto"/>
+            <w:vAlign w:val="center"/>
+            <w:hideMark/>
+          </w:tcPr>
+          <w:p>
+            <w:r>
+              <w:rPr>
+                <w:rFonts w:ascii="Segoe UI Emoji" w:hAnsi="Segoe UI Emoji" w:cs="Segoe UI Emoji"/>
+              </w:rPr>
+              <w:t>✅</w:t>
+            </w:r>
+          </w:p>
+        </w:tc>
+        <w:tc>
+          <w:tcPr>
+            <w:tcW w:w="0" w:type="auto"/>
+            <w:vAlign w:val="center"/>
+            <w:hideMark/>
+          </w:tcPr>
+          <w:p>
+            <w:r>
+              <w:rPr>
+                <w:rFonts w:ascii="Segoe UI Emoji" w:hAnsi="Segoe UI Emoji" w:cs="Segoe UI Emoji"/>
+              </w:rPr>
+              <w:t>❌</w:t>
+            </w:r>
+          </w:p>
+        </w:tc>
+        <w:tc>
+          <w:tcPr>
+            <w:tcW w:w="0" w:type="auto"/>
+            <w:vAlign w:val="center"/>
+            <w:hideMark/>
+          </w:tcPr>
+          <w:p>
+            <w:r>
+              <w:rPr>
+                <w:rFonts w:ascii="Segoe UI Emoji" w:hAnsi="Segoe UI Emoji" w:cs="Segoe UI Emoji"/>
+              </w:rPr>
+              <w:t>❌</w:t>
+            </w:r>
+          </w:p>
+        </w:tc>
+      </w:tr>
+      <w:tr>
+        <w:trPr>
+          <w:tblCellSpacing w:w="15" w:type="dxa"/>
+        </w:trPr>
+        <w:tc>
+          <w:tcPr>
+            <w:tcW w:w="0" w:type="auto"/>
+            <w:vAlign w:val="center"/>
+          </w:tcPr>
+          <w:p>
+            <w:pPr>
+              <w:rPr>
+                <w:b/>
+                <w:bCs/>
+              </w:rPr>
+            </w:pPr>
+          </w:p>
+        </w:tc>
+        <w:tc>
+          <w:tcPr>
+            <w:tcW w:w="0" w:type="auto"/>
+            <w:vAlign w:val="center"/>
+          </w:tcPr>
+          <w:p>
+            <w:pPr>
+              <w:rPr>
+                <w:rFonts w:ascii="Segoe UI Emoji" w:hAnsi="Segoe UI Emoji" w:cs="Segoe UI Emoji"/>
+              </w:rPr>
+            </w:pPr>
+          </w:p>
+        </w:tc>
+        <w:tc>
+          <w:tcPr>
+            <w:tcW w:w="0" w:type="auto"/>
+            <w:vAlign w:val="center"/>
+          </w:tcPr>
+          <w:p>
+            <w:pPr>
+              <w:rPr>
+                <w:rFonts w:ascii="Segoe UI Emoji" w:hAnsi="Segoe UI Emoji" w:cs="Segoe UI Emoji"/>
+              </w:rPr>
+            </w:pPr>
+          </w:p>
+        </w:tc>
+        <w:tc>
+          <w:tcPr>
+            <w:tcW w:w="0" w:type="auto"/>
+            <w:vAlign w:val="center"/>
+          </w:tcPr>
+          <w:p>
+            <w:pPr>
+              <w:rPr>
+                <w:rFonts w:ascii="Segoe UI Emoji" w:hAnsi="Segoe UI Emoji" w:cs="Segoe UI Emoji"/>
+              </w:rPr>
+            </w:pPr>
+          </w:p>
+        </w:tc>
+        <w:tc>
+          <w:tcPr>
+            <w:tcW w:w="0" w:type="auto"/>
+            <w:vAlign w:val="center"/>
+          </w:tcPr>
+          <w:p>
+            <w:pPr>
+              <w:rPr>
+                <w:rFonts w:ascii="Segoe UI Emoji" w:hAnsi="Segoe UI Emoji" w:cs="Segoe UI Emoji"/>
+              </w:rPr>
+            </w:pPr>
+          </w:p>
+        </w:tc>
+        <w:tc>
+          <w:tcPr>
+            <w:tcW w:w="0" w:type="auto"/>
+            <w:vAlign w:val="center"/>
+          </w:tcPr>
+          <w:p>
+            <w:pPr>
+              <w:rPr>
+                <w:rFonts w:ascii="Segoe UI Emoji" w:hAnsi="Segoe UI Emoji" w:cs="Segoe UI Emoji"/>
+              </w:rPr>
+            </w:pPr>
+          </w:p>
+        </w:tc>
+      </w:tr>
+    </w:tbl>
+    <w:p/>
+    <w:p/>
+    <w:p/>
+    <w:p/>
+    <w:p/>
+    <w:p/>
+    <w:p/>
+    <w:p>
+      <w:r>
+        <w:t>The key files I would need to verify next are:</w:t>
+      </w:r>
+    </w:p>
+    <w:p>
+      <w:pPr>
+        <w:numPr>
+          <w:ilvl w:val="0"/>
+          <w:numId w:val="1"/>
+        </w:numPr>
+      </w:pPr>
+      <w:r>
+        <w:t xml:space="preserve">backend/internal/middleware/... — especially </w:t>
+      </w:r>
+      <w:proofErr w:type="spellStart"/>
+      <w:r>
+        <w:t>RequirePermission</w:t>
+      </w:r>
+      <w:proofErr w:type="spellEnd"/>
+      <w:r>
+        <w:t xml:space="preserve"> </w:t>
+      </w:r>
+    </w:p>
+    <w:p>
+      <w:pPr>
+        <w:numPr>
+          <w:ilvl w:val="0"/>
+          <w:numId w:val="1"/>
+        </w:numPr>
+      </w:pPr>
+      <w:r>
+        <w:t>backend/internal/handler/</w:t>
+      </w:r>
+      <w:proofErr w:type="spellStart"/>
+      <w:r>
+        <w:t>auth.go</w:t>
+      </w:r>
+      <w:proofErr w:type="spellEnd"/>
+      <w:r>
+        <w:t xml:space="preserve"> — how permissions are returned at login//me </w:t>
+      </w:r>
+    </w:p>
+    <w:p>
+      <w:pPr>
+        <w:numPr>
+          <w:ilvl w:val="0"/>
+          <w:numId w:val="1"/>
+        </w:numPr>
+      </w:pPr>
+      <w:r>
+        <w:t>frontend/lib/</w:t>
+      </w:r>
+      <w:proofErr w:type="spellStart"/>
+      <w:r>
+        <w:t>api.ts</w:t>
+      </w:r>
+      <w:proofErr w:type="spellEnd"/>
+      <w:r>
+        <w:t xml:space="preserve"> </w:t>
+      </w:r>
+    </w:p>
+    <w:p>
+      <w:pPr>
+        <w:numPr>
+          <w:ilvl w:val="0"/>
+          <w:numId w:val="1"/>
+        </w:numPr>
+      </w:pPr>
+      <w:r>
+        <w:t>frontend/components/</w:t>
+      </w:r>
+      <w:proofErr w:type="spellStart"/>
+      <w:r>
+        <w:t>tt-columns.tsx</w:t>
+      </w:r>
+      <w:proofErr w:type="spellEnd"/>
+      <w:r>
+        <w:t xml:space="preserve"> </w:t>
+      </w:r>
+    </w:p>
+    <w:p>
+      <w:pPr>
+        <w:numPr>
+          <w:ilvl w:val="0"/>
+          <w:numId w:val="1"/>
+        </w:numPr>
+      </w:pPr>
+      <w:r>
+        <w:t>frontend/components/</w:t>
+      </w:r>
+      <w:proofErr w:type="spellStart"/>
+      <w:r>
+        <w:t>TTTable.tsx</w:t>
+      </w:r>
+      <w:proofErr w:type="spellEnd"/>
+      <w:r>
+        <w:t xml:space="preserve"> </w:t>
+      </w:r>
+    </w:p>
+    <w:p>
+      <w:pPr>
+        <w:numPr>
+          <w:ilvl w:val="0"/>
+          <w:numId w:val="1"/>
+        </w:numPr>
+      </w:pPr>
+      <w:r>
+        <w:t>frontend/app/dashboard/</w:t>
+      </w:r>
+      <w:proofErr w:type="spellStart"/>
+      <w:r>
+        <w:t>page.tsx</w:t>
+      </w:r>
+      <w:proofErr w:type="spellEnd"/>
+      <w:r>
+        <w:t xml:space="preserve"> </w:t>
+      </w:r>
+    </w:p>
+    <w:p>
+      <w:r>
+        <w:t xml:space="preserve">If you paste those, I can give you the </w:t>
+      </w:r>
+      <w:r>
+        <w:rPr>
+          <w:b/>
+          <w:bCs/>
+        </w:rPr>
+        <w:t>complete corrected RBAC implementation</w:t>
+      </w:r>
+      <w:r>
+        <w:t xml:space="preserve">, including the exact permission flow from PostgreSQL → Go API → login user → </w:t>
+      </w:r>
+      <w:proofErr w:type="spellStart"/>
+      <w:r>
+        <w:t>TTTable</w:t>
+      </w:r>
+      <w:proofErr w:type="spellEnd"/>
+      <w:r>
+        <w:t xml:space="preserve"> → action buttons.</w:t>
+      </w:r>
+    </w:p>
+    <w:p>
+      <w:r>
+        <w:rPr>
+          <w:vanish/>
+        </w:rPr>
+        <w:t>Top of Form</w:t>
+      </w:r>
+    </w:p>
+    <w:p/>
+    <w:p/>
+    <w:p>
+      <w:r>
+        <w:rPr>
+          <w:noProof/>
+        </w:rPr>
         <w:lastRenderedPageBreak/>
-        <w:t>User Role</w:t>
-      </w:r>
-    </w:p>
-    <w:p>
-      <w:r>
-        <w:t xml:space="preserve">       ↓</w:t>
-      </w:r>
-    </w:p>
-    <w:p>
-      <w:r>
-        <w:t>Role Permissions</w:t>
-      </w:r>
-    </w:p>
-    <w:p>
-      <w:r>
-        <w:t xml:space="preserve">       ↓</w:t>
-      </w:r>
-    </w:p>
-    <w:p>
-      <w:r>
-        <w:t>["TT_VIEW", "TT_ASSIGN", "TT_REQUISITION"]</w:t>
-      </w:r>
-    </w:p>
-    <w:p>
-      <w:r>
-        <w:t xml:space="preserve">       ↓</w:t>
-      </w:r>
-    </w:p>
-    <w:p>
-      <w:proofErr w:type="spellStart"/>
-      <w:proofErr w:type="gramStart"/>
-      <w:r>
-        <w:t>mapTTPermissions</w:t>
+        <w:drawing>
+          <wp:inline distT="0" distB="0" distL="0" distR="0" wp14:anchorId="4452C358" wp14:editId="1B65F0A8">
+            <wp:extent cx="5943600" cy="3186430"/>
+            <wp:effectExtent l="0" t="0" r="0" b="0"/>
+            <wp:docPr id="345868957" name="Picture 1"/>
+            <wp:cNvGraphicFramePr>
+              <a:graphicFrameLocks xmlns:a="http://schemas.openxmlformats.org/drawingml/2006/main" noChangeAspect="1"/>
+            </wp:cNvGraphicFramePr>
+            <a:graphic xmlns:a="http://schemas.openxmlformats.org/drawingml/2006/main">
+              <a:graphicData uri="http://schemas.openxmlformats.org/drawingml/2006/picture">
+                <pic:pic xmlns:pic="http://schemas.openxmlformats.org/drawingml/2006/picture">
+                  <pic:nvPicPr>
+                    <pic:cNvPr id="345868957" name=""/>
+                    <pic:cNvPicPr/>
+                  </pic:nvPicPr>
+                  <pic:blipFill>
+                    <a:blip r:embed="rId8"/>
+                    <a:stretch>
+                      <a:fillRect/>
+                    </a:stretch>
+                  </pic:blipFill>
+                  <pic:spPr>
+                    <a:xfrm>
+                      <a:off x="0" y="0"/>
+                      <a:ext cx="5943600" cy="3186430"/>
+                    </a:xfrm>
+                    <a:prstGeom prst="rect">
+                      <a:avLst/>
+                    </a:prstGeom>
+                  </pic:spPr>
+                </pic:pic>
+              </a:graphicData>
+            </a:graphic>
+          </wp:inline>
+        </w:drawing>
+      </w:r>
+    </w:p>
+    <w:p/>
+    <w:p/>
+    <w:p/>
+    <w:p/>
+    <w:p>
+      <w:r>
+        <w:rPr>
+          <w:noProof/>
+        </w:rPr>
+        <w:drawing>
+          <wp:inline distT="0" distB="0" distL="0" distR="0" wp14:anchorId="627D066A" wp14:editId="27A4F45C">
+            <wp:extent cx="5943600" cy="3199765"/>
+            <wp:effectExtent l="0" t="0" r="0" b="635"/>
+            <wp:docPr id="1885681752" name="Picture 1"/>
+            <wp:cNvGraphicFramePr>
+              <a:graphicFrameLocks xmlns:a="http://schemas.openxmlformats.org/drawingml/2006/main" noChangeAspect="1"/>
+            </wp:cNvGraphicFramePr>
+            <a:graphic xmlns:a="http://schemas.openxmlformats.org/drawingml/2006/main">
+              <a:graphicData uri="http://schemas.openxmlformats.org/drawingml/2006/picture">
+                <pic:pic xmlns:pic="http://schemas.openxmlformats.org/drawingml/2006/picture">
+                  <pic:nvPicPr>
+                    <pic:cNvPr id="1885681752" name=""/>
+                    <pic:cNvPicPr/>
+                  </pic:nvPicPr>
+                  <pic:blipFill>
+                    <a:blip r:embed="rId9"/>
+                    <a:stretch>
+                      <a:fillRect/>
+                    </a:stretch>
+                  </pic:blipFill>
+                  <pic:spPr>
+                    <a:xfrm>
+                      <a:off x="0" y="0"/>
+                      <a:ext cx="5943600" cy="3199765"/>
+                    </a:xfrm>
+                    <a:prstGeom prst="rect">
+                      <a:avLst/>
+                    </a:prstGeom>
+                  </pic:spPr>
+                </pic:pic>
+              </a:graphicData>
+            </a:graphic>
+          </wp:inline>
+        </w:drawing>
+      </w:r>
+    </w:p>
+    <w:p/>
+    <w:p/>
+    <w:p/>
+    <w:p/>
+    <w:p/>
+    <w:p>
+      <w:r>
+        <w:t>Got it. The final TT permission matrix should be:</w:t>
+      </w:r>
+    </w:p>
+    <w:tbl>
+      <w:tblPr>
+        <w:tblW w:w="0" w:type="auto"/>
+        <w:tblCellSpacing w:w="15" w:type="dxa"/>
+        <w:tblCellMar>
+          <w:top w:w="15" w:type="dxa"/>
+          <w:left w:w="15" w:type="dxa"/>
+          <w:bottom w:w="15" w:type="dxa"/>
+          <w:right w:w="15" w:type="dxa"/>
+        </w:tblCellMar>
+        <w:tblLook w:val="04A0" w:firstRow="1" w:lastRow="0" w:firstColumn="1" w:lastColumn="0" w:noHBand="0" w:noVBand="1"/>
+      </w:tblPr>
+      <w:tblGrid>
+        <w:gridCol w:w="1645"/>
+        <w:gridCol w:w="961"/>
+        <w:gridCol w:w="1168"/>
+        <w:gridCol w:w="1735"/>
+        <w:gridCol w:w="872"/>
+        <w:gridCol w:w="1158"/>
+      </w:tblGrid>
+      <w:tr>
+        <w:trPr>
+          <w:tblHeader/>
+          <w:tblCellSpacing w:w="15" w:type="dxa"/>
+        </w:trPr>
+        <w:tc>
+          <w:tcPr>
+            <w:tcW w:w="0" w:type="auto"/>
+            <w:vAlign w:val="center"/>
+            <w:hideMark/>
+          </w:tcPr>
+          <w:p>
+            <w:pPr>
+              <w:rPr>
+                <w:b/>
+                <w:bCs/>
+              </w:rPr>
+            </w:pPr>
+            <w:r>
+              <w:rPr>
+                <w:b/>
+                <w:bCs/>
+              </w:rPr>
+              <w:t>Role</w:t>
+            </w:r>
+          </w:p>
+        </w:tc>
+        <w:tc>
+          <w:tcPr>
+            <w:tcW w:w="0" w:type="auto"/>
+            <w:vAlign w:val="center"/>
+            <w:hideMark/>
+          </w:tcPr>
+          <w:p>
+            <w:pPr>
+              <w:rPr>
+                <w:b/>
+                <w:bCs/>
+              </w:rPr>
+            </w:pPr>
+            <w:r>
+              <w:rPr>
+                <w:b/>
+                <w:bCs/>
+              </w:rPr>
+              <w:t>TT_VIEW</w:t>
+            </w:r>
+          </w:p>
+        </w:tc>
+        <w:tc>
+          <w:tcPr>
+            <w:tcW w:w="0" w:type="auto"/>
+            <w:vAlign w:val="center"/>
+            <w:hideMark/>
+          </w:tcPr>
+          <w:p>
+            <w:pPr>
+              <w:rPr>
+                <w:b/>
+                <w:bCs/>
+              </w:rPr>
+            </w:pPr>
+            <w:r>
+              <w:rPr>
+                <w:b/>
+                <w:bCs/>
+              </w:rPr>
+              <w:t>TT_ASSIGN</w:t>
+            </w:r>
+          </w:p>
+        </w:tc>
+        <w:tc>
+          <w:tcPr>
+            <w:tcW w:w="0" w:type="auto"/>
+            <w:vAlign w:val="center"/>
+            <w:hideMark/>
+          </w:tcPr>
+          <w:p>
+            <w:pPr>
+              <w:rPr>
+                <w:b/>
+                <w:bCs/>
+              </w:rPr>
+            </w:pPr>
+            <w:r>
+              <w:rPr>
+                <w:b/>
+                <w:bCs/>
+              </w:rPr>
+              <w:t>TT_REQUISITION</w:t>
+            </w:r>
+          </w:p>
+        </w:tc>
+        <w:tc>
+          <w:tcPr>
+            <w:tcW w:w="0" w:type="auto"/>
+            <w:vAlign w:val="center"/>
+            <w:hideMark/>
+          </w:tcPr>
+          <w:p>
+            <w:pPr>
+              <w:rPr>
+                <w:b/>
+                <w:bCs/>
+              </w:rPr>
+            </w:pPr>
+            <w:r>
+              <w:rPr>
+                <w:b/>
+                <w:bCs/>
+              </w:rPr>
+              <w:t>TT_EDIT</w:t>
+            </w:r>
+          </w:p>
+        </w:tc>
+        <w:tc>
+          <w:tcPr>
+            <w:tcW w:w="0" w:type="auto"/>
+            <w:vAlign w:val="center"/>
+            <w:hideMark/>
+          </w:tcPr>
+          <w:p>
+            <w:pPr>
+              <w:rPr>
+                <w:b/>
+                <w:bCs/>
+              </w:rPr>
+            </w:pPr>
+            <w:r>
+              <w:rPr>
+                <w:b/>
+                <w:bCs/>
+              </w:rPr>
+              <w:t>TT_DELETE</w:t>
+            </w:r>
+          </w:p>
+        </w:tc>
+      </w:tr>
+      <w:tr>
+        <w:trPr>
+          <w:tblCellSpacing w:w="15" w:type="dxa"/>
+        </w:trPr>
+        <w:tc>
+          <w:tcPr>
+            <w:tcW w:w="0" w:type="auto"/>
+            <w:vAlign w:val="center"/>
+            <w:hideMark/>
+          </w:tcPr>
+          <w:p>
+            <w:r>
+              <w:rPr>
+                <w:b/>
+                <w:bCs/>
+              </w:rPr>
+              <w:t>ROOT</w:t>
+            </w:r>
+          </w:p>
+        </w:tc>
+        <w:tc>
+          <w:tcPr>
+            <w:tcW w:w="0" w:type="auto"/>
+            <w:vAlign w:val="center"/>
+            <w:hideMark/>
+          </w:tcPr>
+          <w:p>
+            <w:r>
+              <w:rPr>
+                <w:rFonts w:ascii="Segoe UI Emoji" w:hAnsi="Segoe UI Emoji" w:cs="Segoe UI Emoji"/>
+              </w:rPr>
+              <w:t>✅</w:t>
+            </w:r>
+          </w:p>
+        </w:tc>
+        <w:tc>
+          <w:tcPr>
+            <w:tcW w:w="0" w:type="auto"/>
+            <w:vAlign w:val="center"/>
+            <w:hideMark/>
+          </w:tcPr>
+          <w:p>
+            <w:r>
+              <w:rPr>
+                <w:rFonts w:ascii="Segoe UI Emoji" w:hAnsi="Segoe UI Emoji" w:cs="Segoe UI Emoji"/>
+              </w:rPr>
+              <w:t>✅</w:t>
+            </w:r>
+          </w:p>
+        </w:tc>
+        <w:tc>
+          <w:tcPr>
+            <w:tcW w:w="0" w:type="auto"/>
+            <w:vAlign w:val="center"/>
+            <w:hideMark/>
+          </w:tcPr>
+          <w:p>
+            <w:r>
+              <w:rPr>
+                <w:rFonts w:ascii="Segoe UI Emoji" w:hAnsi="Segoe UI Emoji" w:cs="Segoe UI Emoji"/>
+              </w:rPr>
+              <w:t>✅</w:t>
+            </w:r>
+          </w:p>
+        </w:tc>
+        <w:tc>
+          <w:tcPr>
+            <w:tcW w:w="0" w:type="auto"/>
+            <w:vAlign w:val="center"/>
+            <w:hideMark/>
+          </w:tcPr>
+          <w:p>
+            <w:r>
+              <w:rPr>
+                <w:rFonts w:ascii="Segoe UI Emoji" w:hAnsi="Segoe UI Emoji" w:cs="Segoe UI Emoji"/>
+              </w:rPr>
+              <w:t>✅</w:t>
+            </w:r>
+          </w:p>
+        </w:tc>
+        <w:tc>
+          <w:tcPr>
+            <w:tcW w:w="0" w:type="auto"/>
+            <w:vAlign w:val="center"/>
+            <w:hideMark/>
+          </w:tcPr>
+          <w:p>
+            <w:r>
+              <w:rPr>
+                <w:rFonts w:ascii="Segoe UI Emoji" w:hAnsi="Segoe UI Emoji" w:cs="Segoe UI Emoji"/>
+              </w:rPr>
+              <w:t>✅</w:t>
+            </w:r>
+          </w:p>
+        </w:tc>
+      </w:tr>
+      <w:tr>
+        <w:trPr>
+          <w:tblCellSpacing w:w="15" w:type="dxa"/>
+        </w:trPr>
+        <w:tc>
+          <w:tcPr>
+            <w:tcW w:w="0" w:type="auto"/>
+            <w:vAlign w:val="center"/>
+            <w:hideMark/>
+          </w:tcPr>
+          <w:p>
+            <w:r>
+              <w:rPr>
+                <w:b/>
+                <w:bCs/>
+              </w:rPr>
+              <w:t>IT_ADMIN</w:t>
+            </w:r>
+          </w:p>
+        </w:tc>
+        <w:tc>
+          <w:tcPr>
+            <w:tcW w:w="0" w:type="auto"/>
+            <w:vAlign w:val="center"/>
+            <w:hideMark/>
+          </w:tcPr>
+          <w:p>
+            <w:r>
+              <w:rPr>
+                <w:rFonts w:ascii="Segoe UI Emoji" w:hAnsi="Segoe UI Emoji" w:cs="Segoe UI Emoji"/>
+              </w:rPr>
+              <w:t>✅</w:t>
+            </w:r>
+          </w:p>
+        </w:tc>
+        <w:tc>
+          <w:tcPr>
+            <w:tcW w:w="0" w:type="auto"/>
+            <w:vAlign w:val="center"/>
+            <w:hideMark/>
+          </w:tcPr>
+          <w:p>
+            <w:r>
+              <w:rPr>
+                <w:rFonts w:ascii="Segoe UI Emoji" w:hAnsi="Segoe UI Emoji" w:cs="Segoe UI Emoji"/>
+              </w:rPr>
+              <w:t>✅</w:t>
+            </w:r>
+          </w:p>
+        </w:tc>
+        <w:tc>
+          <w:tcPr>
+            <w:tcW w:w="0" w:type="auto"/>
+            <w:vAlign w:val="center"/>
+            <w:hideMark/>
+          </w:tcPr>
+          <w:p>
+            <w:r>
+              <w:rPr>
+                <w:rFonts w:ascii="Segoe UI Emoji" w:hAnsi="Segoe UI Emoji" w:cs="Segoe UI Emoji"/>
+              </w:rPr>
+              <w:t>✅</w:t>
+            </w:r>
+          </w:p>
+        </w:tc>
+        <w:tc>
+          <w:tcPr>
+            <w:tcW w:w="0" w:type="auto"/>
+            <w:vAlign w:val="center"/>
+            <w:hideMark/>
+          </w:tcPr>
+          <w:p>
+            <w:r>
+              <w:rPr>
+                <w:rFonts w:ascii="Segoe UI Emoji" w:hAnsi="Segoe UI Emoji" w:cs="Segoe UI Emoji"/>
+              </w:rPr>
+              <w:t>❌</w:t>
+            </w:r>
+          </w:p>
+        </w:tc>
+        <w:tc>
+          <w:tcPr>
+            <w:tcW w:w="0" w:type="auto"/>
+            <w:vAlign w:val="center"/>
+            <w:hideMark/>
+          </w:tcPr>
+          <w:p>
+            <w:r>
+              <w:rPr>
+                <w:rFonts w:ascii="Segoe UI Emoji" w:hAnsi="Segoe UI Emoji" w:cs="Segoe UI Emoji"/>
+              </w:rPr>
+              <w:t>❌</w:t>
+            </w:r>
+          </w:p>
+        </w:tc>
+      </w:tr>
+      <w:tr>
+        <w:trPr>
+          <w:tblCellSpacing w:w="15" w:type="dxa"/>
+        </w:trPr>
+        <w:tc>
+          <w:tcPr>
+            <w:tcW w:w="0" w:type="auto"/>
+            <w:vAlign w:val="center"/>
+            <w:hideMark/>
+          </w:tcPr>
+          <w:p>
+            <w:r>
+              <w:rPr>
+                <w:b/>
+                <w:bCs/>
+              </w:rPr>
+              <w:t>IT_PERSONNEL</w:t>
+            </w:r>
+          </w:p>
+        </w:tc>
+        <w:tc>
+          <w:tcPr>
+            <w:tcW w:w="0" w:type="auto"/>
+            <w:vAlign w:val="center"/>
+            <w:hideMark/>
+          </w:tcPr>
+          <w:p>
+            <w:r>
+              <w:rPr>
+                <w:rFonts w:ascii="Segoe UI Emoji" w:hAnsi="Segoe UI Emoji" w:cs="Segoe UI Emoji"/>
+              </w:rPr>
+              <w:t>❌</w:t>
+            </w:r>
+          </w:p>
+        </w:tc>
+        <w:tc>
+          <w:tcPr>
+            <w:tcW w:w="0" w:type="auto"/>
+            <w:vAlign w:val="center"/>
+            <w:hideMark/>
+          </w:tcPr>
+          <w:p>
+            <w:r>
+              <w:rPr>
+                <w:rFonts w:ascii="Segoe UI Emoji" w:hAnsi="Segoe UI Emoji" w:cs="Segoe UI Emoji"/>
+              </w:rPr>
+              <w:t>❌</w:t>
+            </w:r>
+          </w:p>
+        </w:tc>
+        <w:tc>
+          <w:tcPr>
+            <w:tcW w:w="0" w:type="auto"/>
+            <w:vAlign w:val="center"/>
+            <w:hideMark/>
+          </w:tcPr>
+          <w:p>
+            <w:r>
+              <w:rPr>
+                <w:rFonts w:ascii="Segoe UI Emoji" w:hAnsi="Segoe UI Emoji" w:cs="Segoe UI Emoji"/>
+              </w:rPr>
+              <w:t>❌</w:t>
+            </w:r>
+          </w:p>
+        </w:tc>
+        <w:tc>
+          <w:tcPr>
+            <w:tcW w:w="0" w:type="auto"/>
+            <w:vAlign w:val="center"/>
+            <w:hideMark/>
+          </w:tcPr>
+          <w:p>
+            <w:r>
+              <w:rPr>
+                <w:rFonts w:ascii="Segoe UI Emoji" w:hAnsi="Segoe UI Emoji" w:cs="Segoe UI Emoji"/>
+              </w:rPr>
+              <w:t>❌</w:t>
+            </w:r>
+          </w:p>
+        </w:tc>
+        <w:tc>
+          <w:tcPr>
+            <w:tcW w:w="0" w:type="auto"/>
+            <w:vAlign w:val="center"/>
+            <w:hideMark/>
+          </w:tcPr>
+          <w:p>
+            <w:r>
+              <w:rPr>
+                <w:rFonts w:ascii="Segoe UI Emoji" w:hAnsi="Segoe UI Emoji" w:cs="Segoe UI Emoji"/>
+              </w:rPr>
+              <w:t>❌</w:t>
+            </w:r>
+          </w:p>
+        </w:tc>
+      </w:tr>
+      <w:tr>
+        <w:trPr>
+          <w:tblCellSpacing w:w="15" w:type="dxa"/>
+        </w:trPr>
+        <w:tc>
+          <w:tcPr>
+            <w:tcW w:w="0" w:type="auto"/>
+            <w:vAlign w:val="center"/>
+            <w:hideMark/>
+          </w:tcPr>
+          <w:p>
+            <w:r>
+              <w:rPr>
+                <w:b/>
+                <w:bCs/>
+              </w:rPr>
+              <w:t>GENERAL_USER</w:t>
+            </w:r>
+          </w:p>
+        </w:tc>
+        <w:tc>
+          <w:tcPr>
+            <w:tcW w:w="0" w:type="auto"/>
+            <w:vAlign w:val="center"/>
+            <w:hideMark/>
+          </w:tcPr>
+          <w:p>
+            <w:r>
+              <w:rPr>
+                <w:rFonts w:ascii="Segoe UI Emoji" w:hAnsi="Segoe UI Emoji" w:cs="Segoe UI Emoji"/>
+              </w:rPr>
+              <w:t>❌</w:t>
+            </w:r>
+          </w:p>
+        </w:tc>
+        <w:tc>
+          <w:tcPr>
+            <w:tcW w:w="0" w:type="auto"/>
+            <w:vAlign w:val="center"/>
+            <w:hideMark/>
+          </w:tcPr>
+          <w:p>
+            <w:r>
+              <w:rPr>
+                <w:rFonts w:ascii="Segoe UI Emoji" w:hAnsi="Segoe UI Emoji" w:cs="Segoe UI Emoji"/>
+              </w:rPr>
+              <w:t>❌</w:t>
+            </w:r>
+          </w:p>
+        </w:tc>
+        <w:tc>
+          <w:tcPr>
+            <w:tcW w:w="0" w:type="auto"/>
+            <w:vAlign w:val="center"/>
+            <w:hideMark/>
+          </w:tcPr>
+          <w:p>
+            <w:r>
+              <w:rPr>
+                <w:rFonts w:ascii="Segoe UI Emoji" w:hAnsi="Segoe UI Emoji" w:cs="Segoe UI Emoji"/>
+              </w:rPr>
+              <w:t>❌</w:t>
+            </w:r>
+          </w:p>
+        </w:tc>
+        <w:tc>
+          <w:tcPr>
+            <w:tcW w:w="0" w:type="auto"/>
+            <w:vAlign w:val="center"/>
+            <w:hideMark/>
+          </w:tcPr>
+          <w:p>
+            <w:r>
+              <w:rPr>
+                <w:rFonts w:ascii="Segoe UI Emoji" w:hAnsi="Segoe UI Emoji" w:cs="Segoe UI Emoji"/>
+              </w:rPr>
+              <w:t>❌</w:t>
+            </w:r>
+          </w:p>
+        </w:tc>
+        <w:tc>
+          <w:tcPr>
+            <w:tcW w:w="0" w:type="auto"/>
+            <w:vAlign w:val="center"/>
+            <w:hideMark/>
+          </w:tcPr>
+          <w:p>
+            <w:r>
+              <w:rPr>
+                <w:rFonts w:ascii="Segoe UI Emoji" w:hAnsi="Segoe UI Emoji" w:cs="Segoe UI Emoji"/>
+              </w:rPr>
+              <w:t>❌</w:t>
+            </w:r>
+          </w:p>
+        </w:tc>
+      </w:tr>
+    </w:tbl>
+    <w:p/>
+    <w:p/>
+    <w:p/>
+    <w:p/>
+    <w:p>
+      <w:r>
+        <w:rPr>
+          <w:noProof/>
+        </w:rPr>
+        <w:drawing>
+          <wp:inline distT="0" distB="0" distL="0" distR="0" wp14:anchorId="11B01157" wp14:editId="7045FD91">
+            <wp:extent cx="5943600" cy="3176905"/>
+            <wp:effectExtent l="0" t="0" r="0" b="4445"/>
+            <wp:docPr id="2095793050" name="Picture 1"/>
+            <wp:cNvGraphicFramePr>
+              <a:graphicFrameLocks xmlns:a="http://schemas.openxmlformats.org/drawingml/2006/main" noChangeAspect="1"/>
+            </wp:cNvGraphicFramePr>
+            <a:graphic xmlns:a="http://schemas.openxmlformats.org/drawingml/2006/main">
+              <a:graphicData uri="http://schemas.openxmlformats.org/drawingml/2006/picture">
+                <pic:pic xmlns:pic="http://schemas.openxmlformats.org/drawingml/2006/picture">
+                  <pic:nvPicPr>
+                    <pic:cNvPr id="2095793050" name=""/>
+                    <pic:cNvPicPr/>
+                  </pic:nvPicPr>
+                  <pic:blipFill>
+                    <a:blip r:embed="rId10"/>
+                    <a:stretch>
+                      <a:fillRect/>
+                    </a:stretch>
+                  </pic:blipFill>
+                  <pic:spPr>
+                    <a:xfrm>
+                      <a:off x="0" y="0"/>
+                      <a:ext cx="5943600" cy="3176905"/>
+                    </a:xfrm>
+                    <a:prstGeom prst="rect">
+                      <a:avLst/>
+                    </a:prstGeom>
+                  </pic:spPr>
+                </pic:pic>
+              </a:graphicData>
+            </a:graphic>
+          </wp:inline>
+        </w:drawing>
+      </w:r>
+    </w:p>
+    <w:p/>
+    <w:p/>
+    <w:p/>
+    <w:p/>
+    <w:p/>
+    <w:p/>
+    <w:p/>
+    <w:p/>
+    <w:p/>
+    <w:p/>
+    <w:p/>
+    <w:p/>
+    <w:p/>
+    <w:p>
+      <w:r>
+        <w:t>SELECT</w:t>
+      </w:r>
+    </w:p>
+    <w:p>
+      <w:r>
+        <w:t xml:space="preserve">    id,</w:t>
+      </w:r>
+    </w:p>
+    <w:p>
+      <w:r>
+        <w:t xml:space="preserve">    code,</w:t>
+      </w:r>
+    </w:p>
+    <w:p>
+      <w:r>
+        <w:t xml:space="preserve">    name,</w:t>
+      </w:r>
+    </w:p>
+    <w:p>
+      <w:r>
+        <w:t xml:space="preserve">    </w:t>
+      </w:r>
+      <w:proofErr w:type="spellStart"/>
+      <w:r>
+        <w:t>legacy_user_type</w:t>
+      </w:r>
+      <w:proofErr w:type="spellEnd"/>
+      <w:r>
+        <w:t>,</w:t>
+      </w:r>
+    </w:p>
+    <w:p>
+      <w:r>
+        <w:t xml:space="preserve">    </w:t>
+      </w:r>
+      <w:proofErr w:type="spellStart"/>
+      <w:r>
+        <w:t>hierarchy_level</w:t>
+      </w:r>
+      <w:proofErr w:type="spellEnd"/>
+      <w:r>
+        <w:t>,</w:t>
+      </w:r>
+    </w:p>
+    <w:p>
+      <w:r>
+        <w:t xml:space="preserve">    active</w:t>
+      </w:r>
+    </w:p>
+    <w:p>
+      <w:r>
+        <w:t xml:space="preserve">FROM </w:t>
+      </w:r>
+      <w:proofErr w:type="spellStart"/>
+      <w:r>
+        <w:t>public.auth_roles</w:t>
+      </w:r>
+      <w:proofErr w:type="spellEnd"/>
+    </w:p>
+    <w:p>
+      <w:r>
+        <w:t>WHERE code IN ('ROOT', 'IT_ADMIN')</w:t>
+      </w:r>
+    </w:p>
+    <w:p>
+      <w:r>
+        <w:t xml:space="preserve">ORDER BY </w:t>
+      </w:r>
+      <w:proofErr w:type="spellStart"/>
+      <w:r>
+        <w:t>hierarchy_level</w:t>
+      </w:r>
+      <w:proofErr w:type="spellEnd"/>
+      <w:r>
+        <w:t xml:space="preserve"> DESC;</w:t>
+      </w:r>
+    </w:p>
+    <w:p/>
+    <w:p/>
+    <w:p/>
+    <w:p>
+      <w:r>
+        <w:rPr>
+          <w:noProof/>
+        </w:rPr>
+        <w:lastRenderedPageBreak/>
+        <w:drawing>
+          <wp:inline distT="0" distB="0" distL="0" distR="0" wp14:anchorId="6429DF44" wp14:editId="56FF21CB">
+            <wp:extent cx="5943600" cy="3165475"/>
+            <wp:effectExtent l="0" t="0" r="0" b="0"/>
+            <wp:docPr id="1120453446" name="Picture 1"/>
+            <wp:cNvGraphicFramePr>
+              <a:graphicFrameLocks xmlns:a="http://schemas.openxmlformats.org/drawingml/2006/main" noChangeAspect="1"/>
+            </wp:cNvGraphicFramePr>
+            <a:graphic xmlns:a="http://schemas.openxmlformats.org/drawingml/2006/main">
+              <a:graphicData uri="http://schemas.openxmlformats.org/drawingml/2006/picture">
+                <pic:pic xmlns:pic="http://schemas.openxmlformats.org/drawingml/2006/picture">
+                  <pic:nvPicPr>
+                    <pic:cNvPr id="1120453446" name=""/>
+                    <pic:cNvPicPr/>
+                  </pic:nvPicPr>
+                  <pic:blipFill>
+                    <a:blip r:embed="rId11"/>
+                    <a:stretch>
+                      <a:fillRect/>
+                    </a:stretch>
+                  </pic:blipFill>
+                  <pic:spPr>
+                    <a:xfrm>
+                      <a:off x="0" y="0"/>
+                      <a:ext cx="5943600" cy="3165475"/>
+                    </a:xfrm>
+                    <a:prstGeom prst="rect">
+                      <a:avLst/>
+                    </a:prstGeom>
+                  </pic:spPr>
+                </pic:pic>
+              </a:graphicData>
+            </a:graphic>
+          </wp:inline>
+        </w:drawing>
+      </w:r>
+    </w:p>
+    <w:p/>
+    <w:p/>
+    <w:p/>
+    <w:p>
+      <w:r>
+        <w:rPr>
+          <w:noProof/>
+        </w:rPr>
+        <w:drawing>
+          <wp:inline distT="0" distB="0" distL="0" distR="0" wp14:anchorId="3C895D29" wp14:editId="58E4BE95">
+            <wp:extent cx="5943600" cy="3189605"/>
+            <wp:effectExtent l="0" t="0" r="0" b="0"/>
+            <wp:docPr id="1822430098" name="Picture 1"/>
+            <wp:cNvGraphicFramePr>
+              <a:graphicFrameLocks xmlns:a="http://schemas.openxmlformats.org/drawingml/2006/main" noChangeAspect="1"/>
+            </wp:cNvGraphicFramePr>
+            <a:graphic xmlns:a="http://schemas.openxmlformats.org/drawingml/2006/main">
+              <a:graphicData uri="http://schemas.openxmlformats.org/drawingml/2006/picture">
+                <pic:pic xmlns:pic="http://schemas.openxmlformats.org/drawingml/2006/picture">
+                  <pic:nvPicPr>
+                    <pic:cNvPr id="1822430098" name=""/>
+                    <pic:cNvPicPr/>
+                  </pic:nvPicPr>
+                  <pic:blipFill>
+                    <a:blip r:embed="rId12"/>
+                    <a:stretch>
+                      <a:fillRect/>
+                    </a:stretch>
+                  </pic:blipFill>
+                  <pic:spPr>
+                    <a:xfrm>
+                      <a:off x="0" y="0"/>
+                      <a:ext cx="5943600" cy="3189605"/>
+                    </a:xfrm>
+                    <a:prstGeom prst="rect">
+                      <a:avLst/>
+                    </a:prstGeom>
+                  </pic:spPr>
+                </pic:pic>
+              </a:graphicData>
+            </a:graphic>
+          </wp:inline>
+        </w:drawing>
+      </w:r>
+    </w:p>
+    <w:p/>
+    <w:p/>
+    <w:p/>
+    <w:p>
+      <w:r>
+        <w:t>BEGIN;</w:t>
+      </w:r>
+    </w:p>
+    <w:p/>
+    <w:p>
+      <w:r>
+        <w:t>-- =========================================================</w:t>
+      </w:r>
+    </w:p>
+    <w:p>
+      <w:r>
+        <w:t>-- 1. CREATE TT PERMISSIONS</w:t>
+      </w:r>
+    </w:p>
+    <w:p>
+      <w:r>
+        <w:t>-- =========================================================</w:t>
+      </w:r>
+    </w:p>
+    <w:p/>
+    <w:p>
+      <w:r>
+        <w:t xml:space="preserve">INSERT INTO </w:t>
+      </w:r>
+      <w:proofErr w:type="spellStart"/>
+      <w:r>
+        <w:t>public.auth_permissions</w:t>
+      </w:r>
+      <w:proofErr w:type="spellEnd"/>
+      <w:r>
+        <w:t xml:space="preserve"> (</w:t>
+      </w:r>
+    </w:p>
+    <w:p>
+      <w:r>
+        <w:t xml:space="preserve">    code,</w:t>
+      </w:r>
+    </w:p>
+    <w:p>
+      <w:r>
+        <w:t xml:space="preserve">    name,</w:t>
+      </w:r>
+    </w:p>
+    <w:p>
+      <w:r>
+        <w:t xml:space="preserve">    active</w:t>
+      </w:r>
+    </w:p>
+    <w:p>
+      <w:r>
+        <w:t>)</w:t>
+      </w:r>
+    </w:p>
+    <w:p>
+      <w:r>
+        <w:t>SELECT</w:t>
+      </w:r>
+    </w:p>
+    <w:p>
+      <w:r>
+        <w:t xml:space="preserve">    </w:t>
+      </w:r>
+      <w:proofErr w:type="spellStart"/>
+      <w:r>
+        <w:t>v.code</w:t>
+      </w:r>
+      <w:proofErr w:type="spellEnd"/>
+      <w:r>
+        <w:t>,</w:t>
+      </w:r>
+    </w:p>
+    <w:p>
+      <w:r>
+        <w:t xml:space="preserve">    v.name,</w:t>
+      </w:r>
+    </w:p>
+    <w:p>
+      <w:r>
+        <w:t xml:space="preserve">    TRUE</w:t>
+      </w:r>
+    </w:p>
+    <w:p>
+      <w:r>
+        <w:t>FROM (</w:t>
+      </w:r>
+    </w:p>
+    <w:p>
+      <w:r>
+        <w:t xml:space="preserve">    VALUES</w:t>
+      </w:r>
+    </w:p>
+    <w:p>
+      <w:r>
+        <w:t xml:space="preserve">        ('TT_VIEW',        'Trouble Ticket View'),</w:t>
+      </w:r>
+    </w:p>
+    <w:p>
+      <w:r>
+        <w:t xml:space="preserve">        ('TT_ASSIGN',      'Trouble Ticket Assign'),</w:t>
+      </w:r>
+    </w:p>
+    <w:p>
+      <w:r>
+        <w:t xml:space="preserve">        ('TT_REQUISITION', 'Trouble Ticket Requisition'),</w:t>
+      </w:r>
+    </w:p>
+    <w:p>
+      <w:r>
+        <w:t xml:space="preserve">        ('TT_EDIT',        'Trouble Ticket Edit'),</w:t>
+      </w:r>
+    </w:p>
+    <w:p>
+      <w:r>
+        <w:t xml:space="preserve">        ('TT_DELETE',      'Trouble Ticket Delete')</w:t>
+      </w:r>
+    </w:p>
+    <w:p>
+      <w:r>
+        <w:t>) AS v(code, name)</w:t>
+      </w:r>
+    </w:p>
+    <w:p>
+      <w:r>
+        <w:t>WHERE NOT EXISTS (</w:t>
+      </w:r>
+    </w:p>
+    <w:p>
+      <w:r>
+        <w:t xml:space="preserve">    SELECT 1</w:t>
+      </w:r>
+    </w:p>
+    <w:p>
+      <w:r>
+        <w:lastRenderedPageBreak/>
+        <w:t xml:space="preserve">    FROM </w:t>
+      </w:r>
+      <w:proofErr w:type="spellStart"/>
+      <w:r>
+        <w:t>public.auth_permissions</w:t>
+      </w:r>
+      <w:proofErr w:type="spellEnd"/>
+      <w:r>
+        <w:t xml:space="preserve"> p</w:t>
+      </w:r>
+    </w:p>
+    <w:p>
+      <w:r>
+        <w:t xml:space="preserve">    WHERE </w:t>
+      </w:r>
+      <w:proofErr w:type="spellStart"/>
+      <w:r>
+        <w:t>p.code</w:t>
+      </w:r>
+      <w:proofErr w:type="spellEnd"/>
+      <w:r>
+        <w:t xml:space="preserve"> = </w:t>
+      </w:r>
+      <w:proofErr w:type="spellStart"/>
+      <w:r>
+        <w:t>v.code</w:t>
+      </w:r>
+      <w:proofErr w:type="spellEnd"/>
+    </w:p>
+    <w:p>
+      <w:r>
+        <w:t>);</w:t>
+      </w:r>
+    </w:p>
+    <w:p/>
+    <w:p/>
+    <w:p>
+      <w:r>
+        <w:t>-- =========================================================</w:t>
+      </w:r>
+    </w:p>
+    <w:p>
+      <w:r>
+        <w:t>-- 2. ROOT</w:t>
+      </w:r>
+    </w:p>
+    <w:p>
+      <w:r>
+        <w:t>--    ROOT gets ALL TT permissions</w:t>
+      </w:r>
+    </w:p>
+    <w:p>
+      <w:r>
+        <w:t>-- =========================================================</w:t>
+      </w:r>
+    </w:p>
+    <w:p/>
+    <w:p>
+      <w:r>
+        <w:t xml:space="preserve">INSERT INTO </w:t>
+      </w:r>
+      <w:proofErr w:type="spellStart"/>
+      <w:r>
+        <w:t>public.auth_role_permissions</w:t>
+      </w:r>
+      <w:proofErr w:type="spellEnd"/>
+      <w:r>
+        <w:t xml:space="preserve"> (</w:t>
+      </w:r>
+    </w:p>
+    <w:p>
+      <w:r>
+        <w:t xml:space="preserve">    </w:t>
+      </w:r>
+      <w:proofErr w:type="spellStart"/>
+      <w:r>
+        <w:t>role_id</w:t>
+      </w:r>
+      <w:proofErr w:type="spellEnd"/>
+      <w:r>
+        <w:t>,</w:t>
+      </w:r>
+    </w:p>
+    <w:p>
+      <w:r>
+        <w:t xml:space="preserve">    </w:t>
+      </w:r>
+      <w:proofErr w:type="spellStart"/>
+      <w:r>
+        <w:t>permission_id</w:t>
+      </w:r>
+      <w:proofErr w:type="spellEnd"/>
+    </w:p>
+    <w:p>
+      <w:r>
+        <w:t>)</w:t>
+      </w:r>
+    </w:p>
+    <w:p>
+      <w:r>
+        <w:t>SELECT</w:t>
+      </w:r>
+    </w:p>
+    <w:p>
+      <w:r>
+        <w:t xml:space="preserve">    r.id,</w:t>
+      </w:r>
+    </w:p>
+    <w:p>
+      <w:r>
+        <w:t xml:space="preserve">    p.id</w:t>
+      </w:r>
+    </w:p>
+    <w:p>
+      <w:r>
+        <w:t xml:space="preserve">FROM </w:t>
+      </w:r>
+      <w:proofErr w:type="spellStart"/>
+      <w:r>
+        <w:t>public.auth_roles</w:t>
+      </w:r>
+      <w:proofErr w:type="spellEnd"/>
+      <w:r>
+        <w:t xml:space="preserve"> r</w:t>
+      </w:r>
+    </w:p>
+    <w:p>
+      <w:r>
+        <w:t xml:space="preserve">CROSS JOIN </w:t>
+      </w:r>
+      <w:proofErr w:type="spellStart"/>
+      <w:r>
+        <w:t>public.auth_permissions</w:t>
+      </w:r>
+      <w:proofErr w:type="spellEnd"/>
+      <w:r>
+        <w:t xml:space="preserve"> p</w:t>
+      </w:r>
+    </w:p>
+    <w:p>
+      <w:r>
+        <w:t xml:space="preserve">WHERE </w:t>
+      </w:r>
+      <w:proofErr w:type="spellStart"/>
+      <w:r>
+        <w:t>r.code</w:t>
+      </w:r>
+      <w:proofErr w:type="spellEnd"/>
+      <w:r>
+        <w:t xml:space="preserve"> = 'ROOT'</w:t>
+      </w:r>
+    </w:p>
+    <w:p>
+      <w:r>
+        <w:t xml:space="preserve">  AND </w:t>
+      </w:r>
+      <w:proofErr w:type="spellStart"/>
+      <w:r>
+        <w:t>p.code</w:t>
+      </w:r>
+      <w:proofErr w:type="spellEnd"/>
+      <w:r>
+        <w:t xml:space="preserve"> IN (</w:t>
+      </w:r>
+    </w:p>
+    <w:p>
+      <w:r>
+        <w:t xml:space="preserve">      'TT_VIEW',</w:t>
+      </w:r>
+    </w:p>
+    <w:p>
+      <w:r>
+        <w:t xml:space="preserve">      'TT_ASSIGN',</w:t>
+      </w:r>
+    </w:p>
+    <w:p>
+      <w:r>
+        <w:t xml:space="preserve">      'TT_REQUISITION',</w:t>
+      </w:r>
+    </w:p>
+    <w:p>
+      <w:r>
+        <w:t xml:space="preserve">      'TT_EDIT',</w:t>
+      </w:r>
+    </w:p>
+    <w:p>
+      <w:r>
+        <w:t xml:space="preserve">      'TT_DELETE'</w:t>
+      </w:r>
+    </w:p>
+    <w:p>
+      <w:r>
+        <w:lastRenderedPageBreak/>
+        <w:t xml:space="preserve">  )</w:t>
+      </w:r>
+    </w:p>
+    <w:p>
+      <w:r>
+        <w:t xml:space="preserve">  AND </w:t>
+      </w:r>
+      <w:proofErr w:type="spellStart"/>
+      <w:r>
+        <w:t>p.active</w:t>
+      </w:r>
+      <w:proofErr w:type="spellEnd"/>
+      <w:r>
+        <w:t xml:space="preserve"> = TRUE</w:t>
+      </w:r>
+    </w:p>
+    <w:p>
+      <w:r>
+        <w:t xml:space="preserve">  AND NOT EXISTS (</w:t>
+      </w:r>
+    </w:p>
+    <w:p>
+      <w:r>
+        <w:t xml:space="preserve">      SELECT 1</w:t>
+      </w:r>
+    </w:p>
+    <w:p>
+      <w:r>
+        <w:t xml:space="preserve">      FROM </w:t>
+      </w:r>
+      <w:proofErr w:type="spellStart"/>
+      <w:r>
+        <w:t>public.auth_role_permissions</w:t>
+      </w:r>
+      <w:proofErr w:type="spellEnd"/>
+      <w:r>
+        <w:t xml:space="preserve"> </w:t>
+      </w:r>
+      <w:proofErr w:type="spellStart"/>
+      <w:r>
+        <w:t>rp</w:t>
+      </w:r>
+      <w:proofErr w:type="spellEnd"/>
+    </w:p>
+    <w:p>
+      <w:r>
+        <w:t xml:space="preserve">      WHERE </w:t>
+      </w:r>
+      <w:proofErr w:type="spellStart"/>
+      <w:r>
+        <w:t>rp.role_id</w:t>
+      </w:r>
+      <w:proofErr w:type="spellEnd"/>
+      <w:r>
+        <w:t xml:space="preserve"> = r.id</w:t>
+      </w:r>
+    </w:p>
+    <w:p>
+      <w:r>
+        <w:t xml:space="preserve">        AND </w:t>
+      </w:r>
+      <w:proofErr w:type="spellStart"/>
+      <w:r>
+        <w:t>rp.permission_id</w:t>
+      </w:r>
+      <w:proofErr w:type="spellEnd"/>
+      <w:r>
+        <w:t xml:space="preserve"> = p.id</w:t>
+      </w:r>
+    </w:p>
+    <w:p>
+      <w:r>
+        <w:t xml:space="preserve">  );</w:t>
+      </w:r>
+    </w:p>
+    <w:p/>
+    <w:p/>
+    <w:p>
+      <w:r>
+        <w:t>-- =========================================================</w:t>
+      </w:r>
+    </w:p>
+    <w:p>
+      <w:r>
+        <w:t>-- 3. IT_ADMIN</w:t>
+      </w:r>
+    </w:p>
+    <w:p>
+      <w:r>
+        <w:t>--    IT_ADMIN gets ONLY:</w:t>
+      </w:r>
+    </w:p>
+    <w:p>
+      <w:r>
+        <w:t>--      TT_VIEW</w:t>
+      </w:r>
+    </w:p>
+    <w:p>
+      <w:r>
+        <w:t>--      TT_ASSIGN</w:t>
+      </w:r>
+    </w:p>
+    <w:p>
+      <w:r>
+        <w:t>--      TT_REQUISITION</w:t>
+      </w:r>
+    </w:p>
+    <w:p>
+      <w:r>
+        <w:t>-- =========================================================</w:t>
+      </w:r>
+    </w:p>
+    <w:p/>
+    <w:p>
+      <w:r>
+        <w:t xml:space="preserve">INSERT INTO </w:t>
+      </w:r>
+      <w:proofErr w:type="spellStart"/>
+      <w:r>
+        <w:t>public.auth_role_permissions</w:t>
+      </w:r>
+      <w:proofErr w:type="spellEnd"/>
+      <w:r>
+        <w:t xml:space="preserve"> (</w:t>
+      </w:r>
+    </w:p>
+    <w:p>
+      <w:r>
+        <w:t xml:space="preserve">    </w:t>
+      </w:r>
+      <w:proofErr w:type="spellStart"/>
+      <w:r>
+        <w:t>role_id</w:t>
+      </w:r>
+      <w:proofErr w:type="spellEnd"/>
+      <w:r>
+        <w:t>,</w:t>
+      </w:r>
+    </w:p>
+    <w:p>
+      <w:r>
+        <w:t xml:space="preserve">    </w:t>
+      </w:r>
+      <w:proofErr w:type="spellStart"/>
+      <w:r>
+        <w:t>permission_id</w:t>
+      </w:r>
+      <w:proofErr w:type="spellEnd"/>
+    </w:p>
+    <w:p>
+      <w:r>
+        <w:t>)</w:t>
+      </w:r>
+    </w:p>
+    <w:p>
+      <w:r>
+        <w:t>SELECT</w:t>
+      </w:r>
+    </w:p>
+    <w:p>
+      <w:r>
+        <w:t xml:space="preserve">    r.id,</w:t>
+      </w:r>
+    </w:p>
+    <w:p>
+      <w:r>
+        <w:t xml:space="preserve">    p.id</w:t>
+      </w:r>
+    </w:p>
+    <w:p>
+      <w:r>
+        <w:t xml:space="preserve">FROM </w:t>
+      </w:r>
+      <w:proofErr w:type="spellStart"/>
+      <w:r>
+        <w:t>public.auth_roles</w:t>
+      </w:r>
+      <w:proofErr w:type="spellEnd"/>
+      <w:r>
+        <w:t xml:space="preserve"> r</w:t>
+      </w:r>
+    </w:p>
+    <w:p>
+      <w:r>
+        <w:lastRenderedPageBreak/>
+        <w:t xml:space="preserve">CROSS JOIN </w:t>
+      </w:r>
+      <w:proofErr w:type="spellStart"/>
+      <w:r>
+        <w:t>public.auth_permissions</w:t>
+      </w:r>
+      <w:proofErr w:type="spellEnd"/>
+      <w:r>
+        <w:t xml:space="preserve"> p</w:t>
+      </w:r>
+    </w:p>
+    <w:p>
+      <w:r>
+        <w:t xml:space="preserve">WHERE </w:t>
+      </w:r>
+      <w:proofErr w:type="spellStart"/>
+      <w:r>
+        <w:t>r.code</w:t>
+      </w:r>
+      <w:proofErr w:type="spellEnd"/>
+      <w:r>
+        <w:t xml:space="preserve"> = 'IT_ADMIN'</w:t>
+      </w:r>
+    </w:p>
+    <w:p>
+      <w:r>
+        <w:t xml:space="preserve">  AND </w:t>
+      </w:r>
+      <w:proofErr w:type="spellStart"/>
+      <w:r>
+        <w:t>p.code</w:t>
+      </w:r>
+      <w:proofErr w:type="spellEnd"/>
+      <w:r>
+        <w:t xml:space="preserve"> IN (</w:t>
+      </w:r>
+    </w:p>
+    <w:p>
+      <w:r>
+        <w:t xml:space="preserve">      'TT_VIEW',</w:t>
+      </w:r>
+    </w:p>
+    <w:p>
+      <w:r>
+        <w:t xml:space="preserve">      'TT_ASSIGN',</w:t>
+      </w:r>
+    </w:p>
+    <w:p>
+      <w:r>
+        <w:t xml:space="preserve">      'TT_REQUISITION'</w:t>
+      </w:r>
+    </w:p>
+    <w:p>
+      <w:r>
+        <w:t xml:space="preserve">  )</w:t>
+      </w:r>
+    </w:p>
+    <w:p>
+      <w:r>
+        <w:t xml:space="preserve">  AND </w:t>
+      </w:r>
+      <w:proofErr w:type="spellStart"/>
+      <w:r>
+        <w:t>p.active</w:t>
+      </w:r>
+      <w:proofErr w:type="spellEnd"/>
+      <w:r>
+        <w:t xml:space="preserve"> = TRUE</w:t>
+      </w:r>
+    </w:p>
+    <w:p>
+      <w:r>
+        <w:t xml:space="preserve">  AND NOT EXISTS (</w:t>
+      </w:r>
+    </w:p>
+    <w:p>
+      <w:r>
+        <w:t xml:space="preserve">      SELECT 1</w:t>
+      </w:r>
+    </w:p>
+    <w:p>
+      <w:r>
+        <w:t xml:space="preserve">      FROM </w:t>
+      </w:r>
+      <w:proofErr w:type="spellStart"/>
+      <w:r>
+        <w:t>public.auth_role_permissions</w:t>
+      </w:r>
+      <w:proofErr w:type="spellEnd"/>
+      <w:r>
+        <w:t xml:space="preserve"> </w:t>
+      </w:r>
+      <w:proofErr w:type="spellStart"/>
+      <w:r>
+        <w:t>rp</w:t>
+      </w:r>
+      <w:proofErr w:type="spellEnd"/>
+    </w:p>
+    <w:p>
+      <w:r>
+        <w:t xml:space="preserve">      WHERE </w:t>
+      </w:r>
+      <w:proofErr w:type="spellStart"/>
+      <w:r>
+        <w:t>rp.role_id</w:t>
+      </w:r>
+      <w:proofErr w:type="spellEnd"/>
+      <w:r>
+        <w:t xml:space="preserve"> = r.id</w:t>
+      </w:r>
+    </w:p>
+    <w:p>
+      <w:r>
+        <w:t xml:space="preserve">        AND </w:t>
+      </w:r>
+      <w:proofErr w:type="spellStart"/>
+      <w:r>
+        <w:t>rp.permission_id</w:t>
+      </w:r>
+      <w:proofErr w:type="spellEnd"/>
+      <w:r>
+        <w:t xml:space="preserve"> = p.id</w:t>
+      </w:r>
+    </w:p>
+    <w:p>
+      <w:r>
+        <w:t xml:space="preserve">  );</w:t>
+      </w:r>
+    </w:p>
+    <w:p/>
+    <w:p/>
+    <w:p>
+      <w:r>
+        <w:t>COMMIT;</w:t>
+      </w:r>
+    </w:p>
+    <w:p/>
+    <w:p/>
+    <w:p/>
+    <w:p/>
+    <w:p>
+      <w:r>
+        <w:rPr>
+          <w:noProof/>
+        </w:rPr>
+        <w:lastRenderedPageBreak/>
+        <w:drawing>
+          <wp:inline distT="0" distB="0" distL="0" distR="0" wp14:anchorId="19E95E35" wp14:editId="0BD66D14">
+            <wp:extent cx="5943600" cy="3162300"/>
+            <wp:effectExtent l="0" t="0" r="0" b="0"/>
+            <wp:docPr id="649077312" name="Picture 1"/>
+            <wp:cNvGraphicFramePr>
+              <a:graphicFrameLocks xmlns:a="http://schemas.openxmlformats.org/drawingml/2006/main" noChangeAspect="1"/>
+            </wp:cNvGraphicFramePr>
+            <a:graphic xmlns:a="http://schemas.openxmlformats.org/drawingml/2006/main">
+              <a:graphicData uri="http://schemas.openxmlformats.org/drawingml/2006/picture">
+                <pic:pic xmlns:pic="http://schemas.openxmlformats.org/drawingml/2006/picture">
+                  <pic:nvPicPr>
+                    <pic:cNvPr id="649077312" name=""/>
+                    <pic:cNvPicPr/>
+                  </pic:nvPicPr>
+                  <pic:blipFill>
+                    <a:blip r:embed="rId13"/>
+                    <a:stretch>
+                      <a:fillRect/>
+                    </a:stretch>
+                  </pic:blipFill>
+                  <pic:spPr>
+                    <a:xfrm>
+                      <a:off x="0" y="0"/>
+                      <a:ext cx="5943600" cy="3162300"/>
+                    </a:xfrm>
+                    <a:prstGeom prst="rect">
+                      <a:avLst/>
+                    </a:prstGeom>
+                  </pic:spPr>
+                </pic:pic>
+              </a:graphicData>
+            </a:graphic>
+          </wp:inline>
+        </w:drawing>
+      </w:r>
+      <w:r>
+        <w:br/>
+      </w:r>
+      <w:r>
+        <w:br/>
+      </w:r>
+      <w:r>
+        <w:br/>
+      </w:r>
+      <w:r>
+        <w:br/>
+      </w:r>
+      <w:r>
+        <w:br/>
+      </w:r>
+      <w:r>
+        <w:br/>
+      </w:r>
+      <w:r>
+        <w:br/>
+      </w:r>
+      <w:r>
+        <w:br/>
+      </w:r>
+      <w:r>
+        <w:br/>
+      </w:r>
+      <w:r>
+        <w:br/>
+      </w:r>
+      <w:r>
+        <w:br/>
+        <w:t>SELECT</w:t>
+      </w:r>
+    </w:p>
+    <w:p>
+      <w:r>
+        <w:t xml:space="preserve">    </w:t>
+      </w:r>
+      <w:proofErr w:type="spellStart"/>
+      <w:r>
+        <w:t>r.code</w:t>
+      </w:r>
+      <w:proofErr w:type="spellEnd"/>
+      <w:r>
+        <w:t xml:space="preserve"> AS role,</w:t>
+      </w:r>
+    </w:p>
+    <w:p>
+      <w:r>
+        <w:t xml:space="preserve">    </w:t>
+      </w:r>
+      <w:proofErr w:type="spellStart"/>
+      <w:r>
+        <w:t>p.code</w:t>
+      </w:r>
+      <w:proofErr w:type="spellEnd"/>
+      <w:r>
+        <w:t xml:space="preserve"> AS permission</w:t>
+      </w:r>
+    </w:p>
+    <w:p>
+      <w:r>
+        <w:t xml:space="preserve">FROM </w:t>
+      </w:r>
+      <w:proofErr w:type="spellStart"/>
+      <w:r>
+        <w:t>public.auth_roles</w:t>
+      </w:r>
+      <w:proofErr w:type="spellEnd"/>
+      <w:r>
+        <w:t xml:space="preserve"> r</w:t>
+      </w:r>
+    </w:p>
+    <w:p>
+      <w:r>
+        <w:t xml:space="preserve">JOIN </w:t>
+      </w:r>
+      <w:proofErr w:type="spellStart"/>
+      <w:r>
+        <w:t>public.auth_role_permissions</w:t>
+      </w:r>
+      <w:proofErr w:type="spellEnd"/>
+      <w:r>
+        <w:t xml:space="preserve"> </w:t>
+      </w:r>
+      <w:proofErr w:type="spellStart"/>
+      <w:r>
+        <w:t>rp</w:t>
+      </w:r>
+      <w:proofErr w:type="spellEnd"/>
+    </w:p>
+    <w:p>
+      <w:r>
+        <w:t xml:space="preserve">    ON </w:t>
+      </w:r>
+      <w:proofErr w:type="spellStart"/>
+      <w:r>
+        <w:t>rp.role_id</w:t>
+      </w:r>
+      <w:proofErr w:type="spellEnd"/>
+      <w:r>
+        <w:t xml:space="preserve"> = r.id</w:t>
+      </w:r>
+    </w:p>
+    <w:p>
+      <w:r>
+        <w:t xml:space="preserve">JOIN </w:t>
+      </w:r>
+      <w:proofErr w:type="spellStart"/>
+      <w:r>
+        <w:t>public.auth_permissions</w:t>
+      </w:r>
+      <w:proofErr w:type="spellEnd"/>
+      <w:r>
+        <w:t xml:space="preserve"> p</w:t>
+      </w:r>
+    </w:p>
+    <w:p>
+      <w:r>
+        <w:t xml:space="preserve">    ON p.id = </w:t>
+      </w:r>
+      <w:proofErr w:type="spellStart"/>
+      <w:r>
+        <w:t>rp.permission_id</w:t>
+      </w:r>
+      <w:proofErr w:type="spellEnd"/>
+    </w:p>
+    <w:p>
+      <w:r>
+        <w:t xml:space="preserve">WHERE </w:t>
+      </w:r>
+      <w:proofErr w:type="spellStart"/>
+      <w:r>
+        <w:t>r.code</w:t>
+      </w:r>
+      <w:proofErr w:type="spellEnd"/>
+      <w:r>
+        <w:t xml:space="preserve"> IN ('ROOT', 'IT_ADMIN')</w:t>
+      </w:r>
+    </w:p>
+    <w:p>
+      <w:r>
+        <w:lastRenderedPageBreak/>
+        <w:t xml:space="preserve">  AND </w:t>
+      </w:r>
+      <w:proofErr w:type="spellStart"/>
+      <w:r>
+        <w:t>p.code</w:t>
+      </w:r>
+      <w:proofErr w:type="spellEnd"/>
+      <w:r>
+        <w:t xml:space="preserve"> LIKE 'TT_%'</w:t>
+      </w:r>
+    </w:p>
+    <w:p>
+      <w:r>
+        <w:t>ORDER BY</w:t>
+      </w:r>
+    </w:p>
+    <w:p>
+      <w:r>
+        <w:t xml:space="preserve">    CASE </w:t>
+      </w:r>
+      <w:proofErr w:type="spellStart"/>
+      <w:r>
+        <w:t>r.code</w:t>
+      </w:r>
+      <w:proofErr w:type="spellEnd"/>
+    </w:p>
+    <w:p>
+      <w:r>
+        <w:t xml:space="preserve">        WHEN 'ROOT' THEN 1</w:t>
+      </w:r>
+    </w:p>
+    <w:p>
+      <w:r>
+        <w:t xml:space="preserve">        WHEN 'IT_ADMIN' THEN 2</w:t>
+      </w:r>
+    </w:p>
+    <w:p>
+      <w:r>
+        <w:t xml:space="preserve">        ELSE 3</w:t>
+      </w:r>
+    </w:p>
+    <w:p>
+      <w:r>
+        <w:t xml:space="preserve">    END,</w:t>
+      </w:r>
+    </w:p>
+    <w:p>
+      <w:r>
+        <w:t xml:space="preserve">    </w:t>
+      </w:r>
+      <w:proofErr w:type="spellStart"/>
+      <w:r>
+        <w:t>p.code</w:t>
+      </w:r>
+      <w:proofErr w:type="spellEnd"/>
+      <w:r>
+        <w:t>;</w:t>
+      </w:r>
+    </w:p>
+    <w:p/>
+    <w:p/>
+    <w:p/>
+    <w:p>
+      <w:pPr>
+        <w:rPr>
+          <w:b/>
+          <w:bCs/>
+        </w:rPr>
+      </w:pPr>
+      <w:r>
+        <w:rPr>
+          <w:b/>
+          <w:bCs/>
+        </w:rPr>
+        <w:t>Expected result:</w:t>
+      </w:r>
+    </w:p>
+    <w:p>
+      <w:r>
+        <w:t>ROOT       TT_ASSIGN</w:t>
+      </w:r>
+    </w:p>
+    <w:p>
+      <w:r>
+        <w:t>ROOT       TT_DELETE</w:t>
+      </w:r>
+    </w:p>
+    <w:p>
+      <w:r>
+        <w:t>ROOT       TT_EDIT</w:t>
+      </w:r>
+    </w:p>
+    <w:p>
+      <w:r>
+        <w:t>ROOT       TT_REQUISITION</w:t>
+      </w:r>
+    </w:p>
+    <w:p>
+      <w:pPr>
+        <w:rPr>
+          <w:b/>
+          <w:bCs/>
+        </w:rPr>
+      </w:pPr>
+      <w:r>
+        <w:rPr>
+          <w:b/>
+          <w:bCs/>
+        </w:rPr>
+        <w:t>ROOT       TT_VIEW</w:t>
+      </w:r>
+    </w:p>
+    <w:p/>
+    <w:p>
+      <w:r>
+        <w:t>IT_ADMIN   TT_ASSIGN</w:t>
+      </w:r>
+    </w:p>
+    <w:p>
+      <w:r>
+        <w:t>IT_ADMIN   TT_REQUISITION</w:t>
+      </w:r>
+    </w:p>
+    <w:p>
+      <w:r>
+        <w:t>IT_ADMIN   TT_VIEW</w:t>
+      </w:r>
+    </w:p>
+    <w:p/>
+    <w:p/>
+    <w:p/>
+    <w:p>
+      <w:r>
+        <w:t>SELECT</w:t>
+      </w:r>
+    </w:p>
+    <w:p>
+      <w:r>
+        <w:t xml:space="preserve">    </w:t>
+      </w:r>
+      <w:proofErr w:type="spellStart"/>
+      <w:r>
+        <w:t>r.code</w:t>
+      </w:r>
+      <w:proofErr w:type="spellEnd"/>
+      <w:r>
+        <w:t xml:space="preserve"> AS role,</w:t>
+      </w:r>
+    </w:p>
+    <w:p>
+      <w:r>
+        <w:lastRenderedPageBreak/>
+        <w:t xml:space="preserve">    </w:t>
+      </w:r>
+      <w:proofErr w:type="spellStart"/>
+      <w:r>
+        <w:t>p.code</w:t>
+      </w:r>
+      <w:proofErr w:type="spellEnd"/>
+      <w:r>
+        <w:t xml:space="preserve"> AS permission</w:t>
+      </w:r>
+    </w:p>
+    <w:p>
+      <w:r>
+        <w:t xml:space="preserve">FROM </w:t>
+      </w:r>
+      <w:proofErr w:type="spellStart"/>
+      <w:r>
+        <w:t>public.auth_roles</w:t>
+      </w:r>
+      <w:proofErr w:type="spellEnd"/>
+      <w:r>
+        <w:t xml:space="preserve"> r</w:t>
+      </w:r>
+    </w:p>
+    <w:p>
+      <w:r>
+        <w:t xml:space="preserve">JOIN </w:t>
+      </w:r>
+      <w:proofErr w:type="spellStart"/>
+      <w:r>
+        <w:t>public.auth_role_permissions</w:t>
+      </w:r>
+      <w:proofErr w:type="spellEnd"/>
+      <w:r>
+        <w:t xml:space="preserve"> </w:t>
+      </w:r>
+      <w:proofErr w:type="spellStart"/>
+      <w:r>
+        <w:t>rp</w:t>
+      </w:r>
+      <w:proofErr w:type="spellEnd"/>
+    </w:p>
+    <w:p>
+      <w:r>
+        <w:t xml:space="preserve">    ON </w:t>
+      </w:r>
+      <w:proofErr w:type="spellStart"/>
+      <w:r>
+        <w:t>rp.role_id</w:t>
+      </w:r>
+      <w:proofErr w:type="spellEnd"/>
+      <w:r>
+        <w:t xml:space="preserve"> = r.id</w:t>
+      </w:r>
+    </w:p>
+    <w:p>
+      <w:r>
+        <w:t xml:space="preserve">JOIN </w:t>
+      </w:r>
+      <w:proofErr w:type="spellStart"/>
+      <w:r>
+        <w:t>public.auth_permissions</w:t>
+      </w:r>
+      <w:proofErr w:type="spellEnd"/>
+      <w:r>
+        <w:t xml:space="preserve"> p</w:t>
+      </w:r>
+    </w:p>
+    <w:p>
+      <w:r>
+        <w:t xml:space="preserve">    ON p.id = </w:t>
+      </w:r>
+      <w:proofErr w:type="spellStart"/>
+      <w:r>
+        <w:t>rp.permission_id</w:t>
+      </w:r>
+      <w:proofErr w:type="spellEnd"/>
+    </w:p>
+    <w:p>
+      <w:r>
+        <w:t xml:space="preserve">WHERE </w:t>
+      </w:r>
+      <w:proofErr w:type="spellStart"/>
+      <w:r>
+        <w:t>r.code</w:t>
+      </w:r>
+      <w:proofErr w:type="spellEnd"/>
+      <w:r>
+        <w:t xml:space="preserve"> IN ('ROOT', 'IT_ADMIN')</w:t>
+      </w:r>
+    </w:p>
+    <w:p>
+      <w:r>
+        <w:t xml:space="preserve">  AND </w:t>
+      </w:r>
+      <w:proofErr w:type="spellStart"/>
+      <w:r>
+        <w:t>p.code</w:t>
+      </w:r>
+      <w:proofErr w:type="spellEnd"/>
+      <w:r>
+        <w:t xml:space="preserve"> LIKE 'TT_%'</w:t>
+      </w:r>
+    </w:p>
+    <w:p>
+      <w:r>
+        <w:t>ORDER BY</w:t>
+      </w:r>
+    </w:p>
+    <w:p>
+      <w:r>
+        <w:t xml:space="preserve">    CASE </w:t>
+      </w:r>
+      <w:proofErr w:type="spellStart"/>
+      <w:r>
+        <w:t>r.code</w:t>
+      </w:r>
+      <w:proofErr w:type="spellEnd"/>
+    </w:p>
+    <w:p>
+      <w:r>
+        <w:t xml:space="preserve">        WHEN 'ROOT' THEN 1</w:t>
+      </w:r>
+    </w:p>
+    <w:p>
+      <w:r>
+        <w:t xml:space="preserve">        WHEN 'IT_ADMIN' THEN 2</w:t>
+      </w:r>
+    </w:p>
+    <w:p>
+      <w:r>
+        <w:t xml:space="preserve">        ELSE 3</w:t>
+      </w:r>
+    </w:p>
+    <w:p>
+      <w:r>
+        <w:t xml:space="preserve">    END,</w:t>
+      </w:r>
+    </w:p>
+    <w:p>
+      <w:r>
+        <w:t xml:space="preserve">    </w:t>
+      </w:r>
+      <w:proofErr w:type="spellStart"/>
+      <w:r>
+        <w:t>p.code</w:t>
+      </w:r>
+      <w:proofErr w:type="spellEnd"/>
+      <w:r>
+        <w:t>;</w:t>
+      </w:r>
+    </w:p>
+    <w:p/>
+    <w:p/>
+    <w:p/>
+    <w:p>
+      <w:r>
+        <w:lastRenderedPageBreak/>
+        <w:drawing>
+          <wp:inline distT="0" distB="0" distL="0" distR="0" wp14:anchorId="0CA346E0" wp14:editId="549CF854">
+            <wp:extent cx="5943600" cy="3176905"/>
+            <wp:effectExtent l="0" t="0" r="0" b="4445"/>
+            <wp:docPr id="773347647" name="Picture 1"/>
+            <wp:cNvGraphicFramePr>
+              <a:graphicFrameLocks xmlns:a="http://schemas.openxmlformats.org/drawingml/2006/main" noChangeAspect="1"/>
+            </wp:cNvGraphicFramePr>
+            <a:graphic xmlns:a="http://schemas.openxmlformats.org/drawingml/2006/main">
+              <a:graphicData uri="http://schemas.openxmlformats.org/drawingml/2006/picture">
+                <pic:pic xmlns:pic="http://schemas.openxmlformats.org/drawingml/2006/picture">
+                  <pic:nvPicPr>
+                    <pic:cNvPr id="773347647" name=""/>
+                    <pic:cNvPicPr/>
+                  </pic:nvPicPr>
+                  <pic:blipFill>
+                    <a:blip r:embed="rId14"/>
+                    <a:stretch>
+                      <a:fillRect/>
+                    </a:stretch>
+                  </pic:blipFill>
+                  <pic:spPr>
+                    <a:xfrm>
+                      <a:off x="0" y="0"/>
+                      <a:ext cx="5943600" cy="3176905"/>
+                    </a:xfrm>
+                    <a:prstGeom prst="rect">
+                      <a:avLst/>
+                    </a:prstGeom>
+                  </pic:spPr>
+                </pic:pic>
+              </a:graphicData>
+            </a:graphic>
+          </wp:inline>
+        </w:drawing>
+      </w:r>
+    </w:p>
+    <w:p/>
+    <w:p>
+      <w:r>
+        <w:drawing>
+          <wp:inline distT="0" distB="0" distL="0" distR="0" wp14:anchorId="16E0C619" wp14:editId="58F022D7">
+            <wp:extent cx="5943600" cy="3173730"/>
+            <wp:effectExtent l="0" t="0" r="0" b="7620"/>
+            <wp:docPr id="133335131" name="Picture 1"/>
+            <wp:cNvGraphicFramePr>
+              <a:graphicFrameLocks xmlns:a="http://schemas.openxmlformats.org/drawingml/2006/main" noChangeAspect="1"/>
+            </wp:cNvGraphicFramePr>
+            <a:graphic xmlns:a="http://schemas.openxmlformats.org/drawingml/2006/main">
+              <a:graphicData uri="http://schemas.openxmlformats.org/drawingml/2006/picture">
+                <pic:pic xmlns:pic="http://schemas.openxmlformats.org/drawingml/2006/picture">
+                  <pic:nvPicPr>
+                    <pic:cNvPr id="133335131" name=""/>
+                    <pic:cNvPicPr/>
+                  </pic:nvPicPr>
+                  <pic:blipFill>
+                    <a:blip r:embed="rId15"/>
+                    <a:stretch>
+                      <a:fillRect/>
+                    </a:stretch>
+                  </pic:blipFill>
+                  <pic:spPr>
+                    <a:xfrm>
+                      <a:off x="0" y="0"/>
+                      <a:ext cx="5943600" cy="3173730"/>
+                    </a:xfrm>
+                    <a:prstGeom prst="rect">
+                      <a:avLst/>
+                    </a:prstGeom>
+                  </pic:spPr>
+                </pic:pic>
+              </a:graphicData>
+            </a:graphic>
+          </wp:inline>
+        </w:drawing>
+      </w:r>
+    </w:p>
+    <w:p/>
+    <w:p>
+      <w:r>
+        <w:t xml:space="preserve">forward-logs-shared.ts:95 Download the React </w:t>
+      </w:r>
+      <w:proofErr w:type="spellStart"/>
+      <w:r>
+        <w:t>DevTools</w:t>
+      </w:r>
+      <w:proofErr w:type="spellEnd"/>
+      <w:r>
+        <w:t xml:space="preserve"> for a better development experience: https://react.dev/link/react-devtools</w:t>
+      </w:r>
+    </w:p>
+    <w:p>
+      <w:r>
+        <w:t>forward-logs-shared.ts:95 [HMR] connected</w:t>
+      </w:r>
+    </w:p>
+    <w:p>
+      <w:r>
+        <w:lastRenderedPageBreak/>
+        <w:t>forward-logs-shared.ts:95 [Fast Refresh] rebuilding</w:t>
+      </w:r>
+    </w:p>
+    <w:p>
+      <w:r>
+        <w:t>forward-logs-shared.ts:95 [Fast Refresh] done in 6225ms</w:t>
+      </w:r>
+    </w:p>
+    <w:p>
+      <w:r>
+        <w:t>forward-logs-shared.ts:95 [Fast Refresh] rebuilding</w:t>
+      </w:r>
+    </w:p>
+    <w:p>
+      <w:r>
+        <w:t>forward-logs-shared.ts:95 [Fast Refresh] done in 550ms</w:t>
+      </w:r>
+    </w:p>
+    <w:p>
+      <w:r>
+        <w:t>forward-logs-shared.ts:95 Edit TT: 2026072729788</w:t>
+      </w:r>
+    </w:p>
+    <w:p>
+      <w:r>
+        <w:t>forward-logs-shared.ts:95 Delete TT: 2026072729788</w:t>
+      </w:r>
+    </w:p>
+    <w:p>
+      <w:r>
+        <w:t xml:space="preserve">Warning: Don’t paste code into the </w:t>
+      </w:r>
+      <w:proofErr w:type="spellStart"/>
+      <w:r>
+        <w:t>DevTools</w:t>
+      </w:r>
+      <w:proofErr w:type="spellEnd"/>
+      <w:r>
+        <w:t xml:space="preserve"> Console that you don’t understand or haven’t reviewed yourself. This could allow attackers to steal your identity or take control of your computer. Type "allow pasting" below and press Enter to allow pasting.</w:t>
+      </w:r>
+    </w:p>
+    <w:p>
+      <w:proofErr w:type="spellStart"/>
+      <w:r>
+        <w:t>JSON.parse</w:t>
       </w:r>
       <w:proofErr w:type="spellEnd"/>
       <w:r>
         <w:t>(</w:t>
       </w:r>
-      <w:proofErr w:type="gramEnd"/>
-      <w:r>
-        <w:t>)</w:t>
-      </w:r>
-    </w:p>
-    <w:p>
-      <w:r>
-        <w:t xml:space="preserve">       ↓</w:t>
-      </w:r>
-    </w:p>
-    <w:p>
-      <w:proofErr w:type="spellStart"/>
-      <w:r>
-        <w:t>TTActionPermissions</w:t>
-      </w:r>
-      <w:proofErr w:type="spellEnd"/>
-    </w:p>
-    <w:p>
-      <w:r>
-        <w:t xml:space="preserve">       ↓</w:t>
-      </w:r>
-    </w:p>
-    <w:p>
-      <w:proofErr w:type="spellStart"/>
-      <w:proofErr w:type="gramStart"/>
-      <w:r>
-        <w:t>createTTColumns</w:t>
+      <w:proofErr w:type="spellStart"/>
+      <w:r>
+        <w:t>localStorage.getItem</w:t>
+      </w:r>
+      <w:proofErr w:type="spellEnd"/>
+      <w:r>
+        <w:t>("</w:t>
+      </w:r>
+      <w:proofErr w:type="spellStart"/>
+      <w:r>
+        <w:t>itm_user</w:t>
+      </w:r>
+      <w:proofErr w:type="spellEnd"/>
+      <w:r>
+        <w:t>")).permissions</w:t>
+      </w:r>
+    </w:p>
+    <w:p>
+      <w:r>
+        <w:t>(17) ['</w:t>
+      </w:r>
+      <w:proofErr w:type="spellStart"/>
+      <w:r>
+        <w:t>audit.view</w:t>
+      </w:r>
+      <w:proofErr w:type="spellEnd"/>
+      <w:r>
+        <w:t>', '</w:t>
+      </w:r>
+      <w:proofErr w:type="spellStart"/>
+      <w:r>
+        <w:t>dashboard.self.access</w:t>
+      </w:r>
+      <w:proofErr w:type="spellEnd"/>
+      <w:r>
+        <w:t>', '</w:t>
+      </w:r>
+      <w:proofErr w:type="spellStart"/>
+      <w:r>
+        <w:t>panel.admin.access</w:t>
+      </w:r>
+      <w:proofErr w:type="spellEnd"/>
+      <w:r>
+        <w:t>', '</w:t>
+      </w:r>
+      <w:proofErr w:type="spellStart"/>
+      <w:r>
+        <w:t>panel.staff.access</w:t>
+      </w:r>
+      <w:proofErr w:type="spellEnd"/>
+      <w:r>
+        <w:t>', '</w:t>
+      </w:r>
+      <w:proofErr w:type="spellStart"/>
+      <w:r>
+        <w:t>panel.user.access</w:t>
+      </w:r>
+      <w:proofErr w:type="spellEnd"/>
+      <w:r>
+        <w:t>', '</w:t>
+      </w:r>
+      <w:proofErr w:type="spellStart"/>
+      <w:r>
+        <w:t>requisition.approve</w:t>
+      </w:r>
+      <w:proofErr w:type="spellEnd"/>
+      <w:r>
+        <w:t>', '</w:t>
+      </w:r>
+      <w:proofErr w:type="spellStart"/>
+      <w:r>
+        <w:t>requisition.deliver</w:t>
+      </w:r>
+      <w:proofErr w:type="spellEnd"/>
+      <w:r>
+        <w:t>', '</w:t>
+      </w:r>
+      <w:proofErr w:type="spellStart"/>
+      <w:r>
+        <w:t>requisition.view</w:t>
+      </w:r>
+      <w:proofErr w:type="spellEnd"/>
+      <w:r>
+        <w:t>', '</w:t>
+      </w:r>
+      <w:proofErr w:type="spellStart"/>
+      <w:r>
+        <w:t>roles.manage</w:t>
+      </w:r>
+      <w:proofErr w:type="spellEnd"/>
+      <w:r>
+        <w:t>', '</w:t>
+      </w:r>
+      <w:proofErr w:type="spellStart"/>
+      <w:r>
+        <w:t>system.manage</w:t>
+      </w:r>
+      <w:proofErr w:type="spellEnd"/>
+      <w:r>
+        <w:t>', 'TT_ASSIGN', 'TT_DELETE', 'TT_EDIT', 'TT_REQUISITION', 'TT_VIEW', '</w:t>
+      </w:r>
+      <w:proofErr w:type="spellStart"/>
+      <w:r>
+        <w:t>users.manage</w:t>
+      </w:r>
+      <w:proofErr w:type="spellEnd"/>
+      <w:r>
+        <w:t>', '</w:t>
+      </w:r>
+      <w:proofErr w:type="spellStart"/>
+      <w:r>
+        <w:t>users.view</w:t>
+      </w:r>
+      <w:proofErr w:type="spellEnd"/>
+      <w:r>
+        <w:t>']0: "audit.view"1: "dashboard.self.access"2: "panel.admin.access"3: "panel.staff.access"4: "panel.user.access"5: "requisition.approve"6: "requisition.deliver"7: "requisition.view"8: "roles.manage"9: "system.manage"10: "TT_ASSIGN"11: "TT_DELETE"12: "TT_EDIT"13: "TT_REQUISITION"14: "TT_VIEW"15: "users.manage"16: "</w:t>
+      </w:r>
+      <w:proofErr w:type="spellStart"/>
+      <w:r>
+        <w:t>users.view"length</w:t>
+      </w:r>
+      <w:proofErr w:type="spellEnd"/>
+      <w:r>
+        <w:t>: 17[[Prototype]]: Array(0)</w:t>
+      </w:r>
+    </w:p>
+    <w:p/>
+    <w:p>
+      <w:r>
+        <w:drawing>
+          <wp:inline distT="0" distB="0" distL="0" distR="0" wp14:anchorId="2E3CEDA9" wp14:editId="04E9A57E">
+            <wp:extent cx="5943600" cy="2536825"/>
+            <wp:effectExtent l="0" t="0" r="0" b="0"/>
+            <wp:docPr id="488035813" name="Picture 1"/>
+            <wp:cNvGraphicFramePr>
+              <a:graphicFrameLocks xmlns:a="http://schemas.openxmlformats.org/drawingml/2006/main" noChangeAspect="1"/>
+            </wp:cNvGraphicFramePr>
+            <a:graphic xmlns:a="http://schemas.openxmlformats.org/drawingml/2006/main">
+              <a:graphicData uri="http://schemas.openxmlformats.org/drawingml/2006/picture">
+                <pic:pic xmlns:pic="http://schemas.openxmlformats.org/drawingml/2006/picture">
+                  <pic:nvPicPr>
+                    <pic:cNvPr id="488035813" name=""/>
+                    <pic:cNvPicPr/>
+                  </pic:nvPicPr>
+                  <pic:blipFill>
+                    <a:blip r:embed="rId16"/>
+                    <a:stretch>
+                      <a:fillRect/>
+                    </a:stretch>
+                  </pic:blipFill>
+                  <pic:spPr>
+                    <a:xfrm>
+                      <a:off x="0" y="0"/>
+                      <a:ext cx="5943600" cy="2536825"/>
+                    </a:xfrm>
+                    <a:prstGeom prst="rect">
+                      <a:avLst/>
+                    </a:prstGeom>
+                  </pic:spPr>
+                </pic:pic>
+              </a:graphicData>
+            </a:graphic>
+          </wp:inline>
+        </w:drawing>
+      </w:r>
+    </w:p>
+    <w:p/>
+    <w:p/>
+    <w:p/>
+    <w:p>
+      <w:proofErr w:type="spellStart"/>
+      <w:r>
+        <w:t>JSON.parse</w:t>
       </w:r>
       <w:proofErr w:type="spellEnd"/>
       <w:r>
         <w:t>(</w:t>
       </w:r>
-      <w:proofErr w:type="gramEnd"/>
-      <w:r>
-        <w:t>)</w:t>
-      </w:r>
-    </w:p>
-    <w:p>
-      <w:r>
-        <w:t xml:space="preserve">       ↓</w:t>
-      </w:r>
-    </w:p>
-    <w:p>
-      <w:r>
-        <w:t>Action Menu</w:t>
+      <w:proofErr w:type="spellStart"/>
+      <w:r>
+        <w:t>localStorage.getItem</w:t>
+      </w:r>
+      <w:proofErr w:type="spellEnd"/>
+      <w:r>
+        <w:t>("</w:t>
+      </w:r>
+      <w:proofErr w:type="spellStart"/>
+      <w:r>
+        <w:t>itm_user</w:t>
+      </w:r>
+      <w:proofErr w:type="spellEnd"/>
+      <w:r>
+        <w:t>")).permissions</w:t>
+      </w:r>
+    </w:p>
+    <w:p>
+      <w:pPr>
+        <w:rPr>
+          <w:vanish/>
+        </w:rPr>
+      </w:pPr>
+    </w:p>
+    <w:p>
+      <w:pPr>
+        <w:rPr>
+          <w:vanish/>
+        </w:rPr>
+      </w:pPr>
+      <w:r>
+        <w:rPr>
+          <w:vanish/>
+        </w:rPr>
+        <w:t>Bottom of Form</w:t>
       </w:r>
     </w:p>
     <w:p/>
@@ -394,6 +3365,127 @@
     </w:sectPr>
   </w:body>
 </w:document>
+</file>
+
+<file path=word/numbering.xml><?xml version="1.0" encoding="utf-8"?>
+<w:numbering xmlns:wpc="http://schemas.microsoft.com/office/word/2010/wordprocessingCanvas" xmlns:cx="http://schemas.microsoft.com/office/drawing/2014/chartex" xmlns:cx1="http://schemas.microsoft.com/office/drawing/2015/9/8/chartex" xmlns:cx2="http://schemas.microsoft.com/office/drawing/2015/10/21/chartex" xmlns:cx3="http://schemas.microsoft.com/office/drawing/2016/5/9/chartex" xmlns:cx4="http://schemas.microsoft.com/office/drawing/2016/5/10/chartex" xmlns:cx5="http://schemas.microsoft.com/office/drawing/2016/5/11/chartex" xmlns:cx6="http://schemas.microsoft.com/office/drawing/2016/5/12/chartex" xmlns:cx7="http://schemas.microsoft.com/office/drawing/2016/5/13/chartex" xmlns:cx8="http://schemas.microsoft.com/office/drawing/2016/5/14/chartex" xmlns:mc="http://schemas.openxmlformats.org/markup-compatibility/2006" xmlns:aink="http://schemas.microsoft.com/office/drawing/2016/ink" xmlns:am3d="http://schemas.microsoft.com/office/drawing/2017/model3d" xmlns:o="urn:schemas-microsoft-com:office:office" xmlns:oel="http://schemas.microsoft.com/office/2019/extlst" xmlns:r="http://schemas.openxmlformats.org/officeDocument/2006/relationships" xmlns:m="http://schemas.openxmlformats.org/officeDocument/2006/math" xmlns:v="urn:schemas-microsoft-com:vml" xmlns:wp14="http://schemas.microsoft.com/office/word/2010/wordprocessingDrawing" xmlns:wp="http://schemas.openxmlformats.org/drawingml/2006/wordprocessingDrawing" xmlns:w10="urn:schemas-microsoft-com:office:word" xmlns:w="http://schemas.openxmlformats.org/wordprocessingml/2006/main" xmlns:w14="http://schemas.microsoft.com/office/word/2010/wordml" xmlns:w15="http://schemas.microsoft.com/office/word/2012/wordml" xmlns:w16cex="http://schemas.microsoft.com/office/word/2018/wordml/cex" xmlns:w16cid="http://schemas.microsoft.com/office/word/2016/wordml/cid" xmlns:w16="http://schemas.microsoft.com/office/word/2018/wordml" xmlns:w16du="http://schemas.microsoft.com/office/word/2023/wordml/word16du" xmlns:w16sdtdh="http://schemas.microsoft.com/office/word/2020/wordml/sdtdatahash" xmlns:w16sdtfl="http://schemas.microsoft.com/office/word/2024/wordml/sdtformatlock" xmlns:w16se="http://schemas.microsoft.com/office/word/2015/wordml/symex" xmlns:wpg="http://schemas.microsoft.com/office/word/2010/wordprocessingGroup" xmlns:wpi="http://schemas.microsoft.com/office/word/2010/wordprocessingInk" xmlns:wne="http://schemas.microsoft.com/office/word/2006/wordml" xmlns:wps="http://schemas.microsoft.com/office/word/2010/wordprocessingShape" mc:Ignorable="w14 w15 w16se w16cid w16 w16cex w16sdtdh w16sdtfl w16du wp14">
+  <w:abstractNum w:abstractNumId="0" w15:restartNumberingAfterBreak="0">
+    <w:nsid w:val="217B132D"/>
+    <w:multiLevelType w:val="multilevel"/>
+    <w:tmpl w:val="CB5049BA"/>
+    <w:lvl w:ilvl="0">
+      <w:start w:val="1"/>
+      <w:numFmt w:val="decimal"/>
+      <w:lvlText w:val="%1."/>
+      <w:lvlJc w:val="left"/>
+      <w:pPr>
+        <w:tabs>
+          <w:tab w:val="num" w:pos="720"/>
+        </w:tabs>
+        <w:ind w:left="720" w:hanging="360"/>
+      </w:pPr>
+    </w:lvl>
+    <w:lvl w:ilvl="1" w:tentative="1">
+      <w:start w:val="1"/>
+      <w:numFmt w:val="decimal"/>
+      <w:lvlText w:val="%2."/>
+      <w:lvlJc w:val="left"/>
+      <w:pPr>
+        <w:tabs>
+          <w:tab w:val="num" w:pos="1440"/>
+        </w:tabs>
+        <w:ind w:left="1440" w:hanging="360"/>
+      </w:pPr>
+    </w:lvl>
+    <w:lvl w:ilvl="2" w:tentative="1">
+      <w:start w:val="1"/>
+      <w:numFmt w:val="decimal"/>
+      <w:lvlText w:val="%3."/>
+      <w:lvlJc w:val="left"/>
+      <w:pPr>
+        <w:tabs>
+          <w:tab w:val="num" w:pos="2160"/>
+        </w:tabs>
+        <w:ind w:left="2160" w:hanging="360"/>
+      </w:pPr>
+    </w:lvl>
+    <w:lvl w:ilvl="3" w:tentative="1">
+      <w:start w:val="1"/>
+      <w:numFmt w:val="decimal"/>
+      <w:lvlText w:val="%4."/>
+      <w:lvlJc w:val="left"/>
+      <w:pPr>
+        <w:tabs>
+          <w:tab w:val="num" w:pos="2880"/>
+        </w:tabs>
+        <w:ind w:left="2880" w:hanging="360"/>
+      </w:pPr>
+    </w:lvl>
+    <w:lvl w:ilvl="4" w:tentative="1">
+      <w:start w:val="1"/>
+      <w:numFmt w:val="decimal"/>
+      <w:lvlText w:val="%5."/>
+      <w:lvlJc w:val="left"/>
+      <w:pPr>
+        <w:tabs>
+          <w:tab w:val="num" w:pos="3600"/>
+        </w:tabs>
+        <w:ind w:left="3600" w:hanging="360"/>
+      </w:pPr>
+    </w:lvl>
+    <w:lvl w:ilvl="5" w:tentative="1">
+      <w:start w:val="1"/>
+      <w:numFmt w:val="decimal"/>
+      <w:lvlText w:val="%6."/>
+      <w:lvlJc w:val="left"/>
+      <w:pPr>
+        <w:tabs>
+          <w:tab w:val="num" w:pos="4320"/>
+        </w:tabs>
+        <w:ind w:left="4320" w:hanging="360"/>
+      </w:pPr>
+    </w:lvl>
+    <w:lvl w:ilvl="6" w:tentative="1">
+      <w:start w:val="1"/>
+      <w:numFmt w:val="decimal"/>
+      <w:lvlText w:val="%7."/>
+      <w:lvlJc w:val="left"/>
+      <w:pPr>
+        <w:tabs>
+          <w:tab w:val="num" w:pos="5040"/>
+        </w:tabs>
+        <w:ind w:left="5040" w:hanging="360"/>
+      </w:pPr>
+    </w:lvl>
+    <w:lvl w:ilvl="7" w:tentative="1">
+      <w:start w:val="1"/>
+      <w:numFmt w:val="decimal"/>
+      <w:lvlText w:val="%8."/>
+      <w:lvlJc w:val="left"/>
+      <w:pPr>
+        <w:tabs>
+          <w:tab w:val="num" w:pos="5760"/>
+        </w:tabs>
+        <w:ind w:left="5760" w:hanging="360"/>
+      </w:pPr>
+    </w:lvl>
+    <w:lvl w:ilvl="8" w:tentative="1">
+      <w:start w:val="1"/>
+      <w:numFmt w:val="decimal"/>
+      <w:lvlText w:val="%9."/>
+      <w:lvlJc w:val="left"/>
+      <w:pPr>
+        <w:tabs>
+          <w:tab w:val="num" w:pos="6480"/>
+        </w:tabs>
+        <w:ind w:left="6480" w:hanging="360"/>
+      </w:pPr>
+    </w:lvl>
+  </w:abstractNum>
+  <w:num w:numId="1" w16cid:durableId="2085569167">
+    <w:abstractNumId w:val="0"/>
+  </w:num>
+</w:numbering>
 </file>
 
 <file path=word/styles.xml><?xml version="1.0" encoding="utf-8"?>

</xml_diff>